<commit_message>
docs(毕业设计): expand mid-term report theoretical analysis to ~5000 chars
Add comprehensive theoretical framework with 20+ formulas covering:
- EMAT physics (Lorentz force, elastic wave, echo signal, contact detection)
- Multi-modal temporal modeling (modal encoding, cross-modal attention)
- Physics-constrained attention mechanism (constraint matrix, loss function)
- State transition constraint model (HMM, smoothing, CRF)

Co-Authored-By: Claude Opus 4.7 <noreply@anthropic.com>
</commit_message>
<xml_diff>
--- a/毕业设计/中期/华羽霄_中期报告表.docx
+++ b/毕业设计/中期/华羽霄_中期报告表.docx
@@ -498,7 +498,7 @@
                 <w:sz w:val="21"/>
                 <w:szCs w:val="21"/>
               </w:rPr>
-              <w:t xml:space="preserve">本课题面向无人机无损检测场景中接触状态难以精确判定的问题，提出构建融合电磁超声回波、位姿误差及RGBD局部视觉特征的多模态时序感知模型。自开题报告通过以来，课题按照既定研究计划有序推进，已完成文献调研与理论框架搭建、无人机实验平台搭建与集成、电磁超声探头硬件开发与调试、多模态数据采集系统构建等关键工作，目前正处于多模态融合算法设计与实验验证阶段。</w:t>
+              <w:t xml:space="preserve">本课题面向无人机无损检测中探头接触状态难以精确判定的核心问题，构建融合电磁超声回波、位姿误差及RGBD视觉特征的多模态时序感知模型。自开题以来，课题按计划推进，已完成文献调研、实验平台搭建、EMAT硬件开发及数据采集系统构建等关键工作。当前处于多模态融合算法设计与实验验证阶段。</w:t>
             </w:r>
           </w:p>
           <w:p>
@@ -573,7 +573,7 @@
                 <w:sz w:val="21"/>
                 <w:szCs w:val="21"/>
               </w:rPr>
-              <w:t xml:space="preserve">系统梳理了无人机接触式无损检测、电磁超声换能器（EMAT）原理与测厚技术、物理约束神经网络与Transformer架构三大方向的国内外研究现状。完成文献阅读与整理32篇，涵盖无人机NDT系统设计（Watson等、Marcellini等、Kocer等）、EMAT测厚方法（Chen、Kubrusly、涂君等）、物理信息神经网络（RAMP-Net、PINNsFormer、MPFusionNet）等核心领域。明确了三大关键技术问题：单模态检测在动态飞行平台上的局限性、纯数据驱动模型缺乏物理约束导致的泛化不足、接触判定结果的时序抖动问题。</w:t>
+              <w:t xml:space="preserve">系统梳理了三个方向的国内外研究现状：无人机接触式无损检测、电磁超声换能器原理与测厚技术、物理约束神经网络与Transformer架构。共完成32篇文献的阅读与整理，涵盖无人机NDT系统设计（Watson等、Marcellini等、Kocer等）、EMAT测厚方法（Chen、Kubrusly、涂君等）、物理信息神经网络（RAMP-Net、PINNsFormer、MPFusionNet）等核心领域。由此明确三大关键技术问题：单模态检测在动态飞行平台上的局限性、纯数据驱动模型缺乏物理约束导致的泛化不足、接触判定结果的时序抖动。</w:t>
             </w:r>
           </w:p>
           <w:p>
@@ -618,7 +618,7 @@
                 <w:sz w:val="21"/>
                 <w:szCs w:val="21"/>
               </w:rPr>
-              <w:t xml:space="preserve">完成无人机整体系统平台搭建，集成Livox MID-360三维激光雷达、Intel RealSense D435深度相机与PX4飞控系统。通过MAVROS实现飞控与地面计算机的通信，利用FAST-LIO 2.0（IEKF + ikd-Tree）实现LiDAR-inertial里程计，提供实时6-DOF位姿估计。开发lidar_to_mavros.py桥接节点，将FAST-LIO里程计转换为MAVROS视觉位姿，为PX4提供位姿反馈。实现无人机在遥控控制下的姿态稳定飞行，飞控系统运行可靠。</w:t>
+              <w:t xml:space="preserve">完成无人机系统平台搭建，集成Livox MID-360激光雷达、Intel RealSense D435深度相机与PX4飞控。通过MAVROS实现飞控与地面计算机通信，利用FAST-LIO 2.0（IEKF + ikd-Tree）提供实时6-DOF位姿估计。开发lidar_to_mavros.py桥接节点，将里程计数据转换为MAVROS视觉位姿反馈。系统已实现遥控下的姿态稳定飞行。</w:t>
             </w:r>
           </w:p>
           <w:p>
@@ -663,7 +663,7 @@
                 <w:sz w:val="21"/>
                 <w:szCs w:val="21"/>
               </w:rPr>
-              <w:t xml:space="preserve">完成EMAT电磁超声探头的制作与调试。开发ROS驱动节点（emat_thickness_gauge_node），通过USB直连CH346C芯片，以二进制协议（头0xAB，CRC-8校验）实现探头通信。支持厚度读取（0x00）、波形采集（0x01，4块×8185采样点，8-bit ADC）、参数设置（0x03/0x04）等命令。实现约40Hz的波形采集频率，通过串口稳定传输至上位机。开发Qt5 C++波形可视化工具（WaveformWidget），采用ring buffer + QTimer架构（25ms/40Hz刷新），支持DC去除、网格叠加、RMS显示等功能。配置udev规则避免sudo依赖，实现设备断线自动重连。</w:t>
+              <w:t xml:space="preserve">完成EMAT探头制作与调试。开发ROS驱动节点，通过USB直连CH346C芯片，以二进制协议（0xAB头，CRC-8校验）实现通信。支持厚度读取、波形采集（4块×8185采样点，8-bit ADC）、参数配置等命令。波形采集频率约40 Hz。开发Qt5 C++可视化工具，采用ring buffer + QTimer架构（25 ms刷新），支持DC去除与RMS显示。通过udev规则实现免sudo访问，具备断线自动重连能力。</w:t>
             </w:r>
           </w:p>
           <w:p>
@@ -708,7 +708,7 @@
                 <w:sz w:val="21"/>
                 <w:szCs w:val="21"/>
               </w:rPr>
-              <w:t xml:space="preserve">开发基于视觉ROI的自主规划程序，用户在RGB图像中选取目标区域后，系统完成路径规划与末端精确接近。每次实验飞行过程中，系统同步采集无人机位姿、目标位姿及RGBD视频流数据，构建结构化多模态数据集。实现EMAT回波信号与飞行数据的同步记录，为后续模型训练与验证提供数据支撑。开发record节点，记录CSV格式的位姿数据与RGB/depth视频。</w:t>
+              <w:t xml:space="preserve">开发基于视觉ROI的自主规划程序：用户在RGB图像中选取目标区域后，系统完成路径规划与末端精确接近。飞行过程中同步采集位姿、RGBD视频流与EMAT回波信号，构建结构化多模态数据集，为后续模型训练提供数据支撑。</w:t>
             </w:r>
           </w:p>
           <w:p>
@@ -753,7 +753,7 @@
                 <w:sz w:val="21"/>
                 <w:szCs w:val="21"/>
               </w:rPr>
-              <w:t xml:space="preserve">实现无人机在完全自动驾驶下对任意曲面的稳定接触。采用位置-速度串级PID控制，实现接触点位的精确控制闭环。验证了从视觉引导→接近→接触建立→稳定扫查的完整流程，为后续多模态融合算法的实验验证奠定基础。</w:t>
+              <w:t xml:space="preserve">实现无人机完全自动驾驶下的任意曲面稳定接触。采用位置-速度串级PID控制，验证了从视觉引导到接触建立再到稳定扫查的完整流程。</w:t>
             </w:r>
           </w:p>
           <w:p>
@@ -772,7 +772,7 @@
           </w:p>
           <w:p>
             <w:pPr>
-              <w:spacing w:after="0" w:before="120" w:line="360"/>
+              <w:spacing w:after="0" w:before="0" w:line="360"/>
               <w:jc w:val="left"/>
             </w:pPr>
             <w:r>
@@ -813,22 +813,96 @@
                 <w:sz w:val="21"/>
                 <w:szCs w:val="21"/>
               </w:rPr>
-              <w:t xml:space="preserve">3.1 多模态时序建模框架设计</w:t>
-            </w:r>
-          </w:p>
-          <w:p>
-            <w:pPr>
-              <w:spacing w:after="0" w:before="0" w:line="360"/>
-              <w:ind w:firstLine="420"/>
-              <w:jc w:val="left"/>
-            </w:pPr>
-            <w:r>
-              <w:rPr>
-                <w:rFonts w:ascii="宋体" w:cs="宋体" w:eastAsia="宋体" w:hAnsi="宋体"/>
-                <w:sz w:val="21"/>
-                <w:szCs w:val="21"/>
-              </w:rPr>
-              <w:t xml:space="preserve">设计了融合物理约束注意力机制的Transformer网络架构。系统输入为三类时间序列：超声回波特征f_u(t)、位姿误差特征f_p(t)、视觉ROI特征f_v(t)。各模态通过独立编码器（1D-CNN+位置编码、MLP、CNN/ViT）映射至统一特征空间，随后通过跨模态注意力机制实现特征对齐与深层交互。最终融合表示通过时序Transformer建模，输出当前接触状态向量。</w:t>
+              <w:t xml:space="preserve">3.1 电磁超声无损检测理论</w:t>
+            </w:r>
+          </w:p>
+          <w:p>
+            <w:pPr>
+              <w:spacing w:after="0" w:before="0" w:line="360"/>
+              <w:jc w:val="left"/>
+            </w:pPr>
+            <w:r>
+              <w:rPr>
+                <w:rFonts w:ascii="宋体" w:cs="宋体" w:eastAsia="宋体" w:hAnsi="宋体"/>
+                <w:sz w:val="21"/>
+                <w:szCs w:val="21"/>
+              </w:rPr>
+              <w:t xml:space="preserve"/>
+            </w:r>
+          </w:p>
+          <w:p>
+            <w:pPr>
+              <w:spacing w:after="0" w:before="0" w:line="360"/>
+              <w:ind w:firstLine="420"/>
+              <w:jc w:val="left"/>
+            </w:pPr>
+            <w:r>
+              <w:rPr>
+                <w:rFonts w:ascii="宋体" w:cs="宋体" w:eastAsia="宋体" w:hAnsi="宋体"/>
+                <w:sz w:val="21"/>
+                <w:szCs w:val="21"/>
+              </w:rPr>
+              <w:t xml:space="preserve">电磁超声检测（EMAT）是一种基于电磁耦合机制的非接触式超声激励与接收技术。其基本原理是在导电材料表面施加交变电磁场，通过洛伦兹力或磁致伸缩效应产生弹性波，并利用感应线圈接收反射波信号。与传统压电超声相比，EMAT无需耦合剂，适用于高温、高速运动等恶劣工况。本节阐述EMAT的理论基础及其在接触状态检测中的应用。</w:t>
+            </w:r>
+          </w:p>
+          <w:p>
+            <w:pPr>
+              <w:spacing w:after="0" w:before="0" w:line="360"/>
+              <w:ind w:firstLine="420"/>
+              <w:jc w:val="left"/>
+            </w:pPr>
+            <w:r>
+              <w:rPr>
+                <w:rFonts w:ascii="宋体" w:cs="宋体" w:eastAsia="宋体" w:hAnsi="宋体"/>
+                <w:sz w:val="21"/>
+                <w:szCs w:val="21"/>
+              </w:rPr>
+              <w:t xml:space="preserve">（1）洛伦兹力激励模型。在导电材料中，交变电流密度J与静磁场B作用产生体力密度f = J × B。其中电流密度满足 J = σ(E + v × B)，σ为电导率，E为电场强度，v为粒子速度。该体力密度作为弹性波的激励源，在材料内部传播形成超声信号。对于EMAT线圈，通入交变电流后在导体表面感应涡流，涡流与永磁体静态磁场耦合产生洛伦兹力，进而激发超声波。该机制决定了EMAT的换能效率与材料电导率、磁场强度密切相关。</w:t>
+            </w:r>
+          </w:p>
+          <w:p>
+            <w:pPr>
+              <w:spacing w:after="0" w:before="0" w:line="360"/>
+              <w:ind w:firstLine="420"/>
+              <w:jc w:val="left"/>
+            </w:pPr>
+            <w:r>
+              <w:rPr>
+                <w:rFonts w:ascii="宋体" w:cs="宋体" w:eastAsia="宋体" w:hAnsi="宋体"/>
+                <w:sz w:val="21"/>
+                <w:szCs w:val="21"/>
+              </w:rPr>
+              <w:t xml:space="preserve">（2）弹性波传播方程。材料内部的超声波传播满足弹性动力学方程：ρ·∂²u/∂t² = ∇·σ + f，其中ρ为密度，u为位移矢量，σ为应力张量，f为体力密度（洛伦兹力）。在各向同性材料中，应力与应变满足胡克定律 σ = C:ε，其中C为四阶弹性张量，ε = (∇u + (∇u)ᵀ)/2 为应变张量。对于纵波，波速c_L = √((λ+2μ)/ρ)；对于横波，波速c_T = √(μ/ρ)，其中λ和μ为拉梅常数。超声波在传播过程中遇到界面会发生反射和折射，反射系数取决于两侧介质的声阻抗差异。</w:t>
+            </w:r>
+          </w:p>
+          <w:p>
+            <w:pPr>
+              <w:spacing w:after="0" w:before="0" w:line="360"/>
+              <w:ind w:firstLine="420"/>
+              <w:jc w:val="left"/>
+            </w:pPr>
+            <w:r>
+              <w:rPr>
+                <w:rFonts w:ascii="宋体" w:cs="宋体" w:eastAsia="宋体" w:hAnsi="宋体"/>
+                <w:sz w:val="21"/>
+                <w:szCs w:val="21"/>
+              </w:rPr>
+              <w:t xml:space="preserve">（3）超声回波信号模型。超声回波信号可表示为时域响应函数 s(t) = A(t)·sin(2πf₀t + φ)，其中A(t)表示衰减包络，f₀为中心频率，φ为初始相位。衰减包络通常服从指数衰减规律 A(t) = A₀·exp(-αt)，α为衰减系数。当探头与被测表面接触时，接触刚度k的变化导致反射系数R改变：R = (Z₂ - Z₁)/(Z₂ + Z₁)，其中Z₁、Z₂分别为两种介质的声阻抗。接触状态变化本质上改变边界条件，从而影响反射波幅值与相位。当探头完全接触时，反射系数最小，透射能量最大；当探头脱离时，反射系数趋近于1。</w:t>
+            </w:r>
+          </w:p>
+          <w:p>
+            <w:pPr>
+              <w:spacing w:after="0" w:before="0" w:line="360"/>
+              <w:ind w:firstLine="420"/>
+              <w:jc w:val="left"/>
+            </w:pPr>
+            <w:r>
+              <w:rPr>
+                <w:rFonts w:ascii="宋体" w:cs="宋体" w:eastAsia="宋体" w:hAnsi="宋体"/>
+                <w:sz w:val="21"/>
+                <w:szCs w:val="21"/>
+              </w:rPr>
+              <w:t xml:space="preserve">（4）接触状态检测模型。接触检测可建模为信号统计特征分布变化问题。设接触状态为s ∈ {接触, 非接触}，观测信号为x(t)，则接触概率可表示为P(s=接触|x) = σ(wᵀ·Φ(x) + b)，其中Φ(x)为信号特征提取函数，包括信号幅值、频率、相位等统计特征，σ为sigmoid激活函数。该模型将接触判定从阈值判断提升为概率估计，为后续多模态融合奠定基础。在实际应用中，单一超声信号受噪声干扰较大，需结合其他传感器信息提高判定可靠性。</w:t>
             </w:r>
           </w:p>
           <w:p>
@@ -858,22 +932,81 @@
                 <w:sz w:val="21"/>
                 <w:szCs w:val="21"/>
               </w:rPr>
-              <w:t xml:space="preserve">3.2 物理约束注意力机制</w:t>
-            </w:r>
-          </w:p>
-          <w:p>
-            <w:pPr>
-              <w:spacing w:after="0" w:before="0" w:line="360"/>
-              <w:ind w:firstLine="420"/>
-              <w:jc w:val="left"/>
-            </w:pPr>
-            <w:r>
-              <w:rPr>
-                <w:rFonts w:ascii="宋体" w:cs="宋体" w:eastAsia="宋体" w:hAnsi="宋体"/>
-                <w:sz w:val="21"/>
-                <w:szCs w:val="21"/>
-              </w:rPr>
-              <w:t xml:space="preserve">在传统自注意力计算中引入物理约束矩阵P，基于无人机动力学模型构造约束项。平移运动模型：m·a = F_thrust - mg - F_drag；姿态变化模型：I·α = τ - τ_disturbance。接触物理先验：法向力突变时||Δv_t|| ≈ 0。损失函数设计为L = L_CE + λ·L_physics，其中L_CE为接触概率交叉熵损失，L_physics为物理残差损失，强制输出满足动力学合理性。</w:t>
+              <w:t xml:space="preserve">3.2 多模态时序建模框架设计</w:t>
+            </w:r>
+          </w:p>
+          <w:p>
+            <w:pPr>
+              <w:spacing w:after="0" w:before="0" w:line="360"/>
+              <w:jc w:val="left"/>
+            </w:pPr>
+            <w:r>
+              <w:rPr>
+                <w:rFonts w:ascii="宋体" w:cs="宋体" w:eastAsia="宋体" w:hAnsi="宋体"/>
+                <w:sz w:val="21"/>
+                <w:szCs w:val="21"/>
+              </w:rPr>
+              <w:t xml:space="preserve"/>
+            </w:r>
+          </w:p>
+          <w:p>
+            <w:pPr>
+              <w:spacing w:after="0" w:before="0" w:line="360"/>
+              <w:ind w:firstLine="420"/>
+              <w:jc w:val="left"/>
+            </w:pPr>
+            <w:r>
+              <w:rPr>
+                <w:rFonts w:ascii="宋体" w:cs="宋体" w:eastAsia="宋体" w:hAnsi="宋体"/>
+                <w:sz w:val="21"/>
+                <w:szCs w:val="21"/>
+              </w:rPr>
+              <w:t xml:space="preserve">系统输入为三类时间序列：超声回波特征x_u(t) ∈ ℝ^{d_u}、位姿误差特征x_p(t) ∈ ℝ^{d_p}、视觉ROI特征x_v(t) ∈ ℝ^{d_v}。三者采样频率不同（EMAT约40 Hz，位姿约100 Hz，视觉约30 Hz），需通过时序对齐统一至相同时间尺度。多模态融合的核心挑战在于：如何在保持各模态特性的同时，实现跨模态信息的有效交互与互补。</w:t>
+            </w:r>
+          </w:p>
+          <w:p>
+            <w:pPr>
+              <w:spacing w:after="0" w:before="0" w:line="360"/>
+              <w:ind w:firstLine="420"/>
+              <w:jc w:val="left"/>
+            </w:pPr>
+            <w:r>
+              <w:rPr>
+                <w:rFonts w:ascii="宋体" w:cs="宋体" w:eastAsia="宋体" w:hAnsi="宋体"/>
+                <w:sz w:val="21"/>
+                <w:szCs w:val="21"/>
+              </w:rPr>
+              <w:t xml:space="preserve">（1）模态编码。各模态先通过独立编码器映射至统一特征空间：f_u(t) = E_u(x_u(t))，其中E_u为一维卷积网络加位置编码，用于提取超声信号的时频特征；f_p(t) = E_p(x_p(t))，其中E_p为多层感知机，用于编码位姿误差的动态变化；f_v(t) = E_v(x_v(t))，其中E_v为CNN或Vision Transformer，用于提取视觉ROI的几何与纹理特征。编码后的特征维度统一为d_model，便于后续跨模态交互。位置编码采用正弦余弦函数：PE(pos,2i) = sin(pos/10000^{2i/d_model})，PE(pos,2i+1) = cos(pos/10000^{2i/d_model})，以保留时序信息。</w:t>
+            </w:r>
+          </w:p>
+          <w:p>
+            <w:pPr>
+              <w:spacing w:after="0" w:before="0" w:line="360"/>
+              <w:ind w:firstLine="420"/>
+              <w:jc w:val="left"/>
+            </w:pPr>
+            <w:r>
+              <w:rPr>
+                <w:rFonts w:ascii="宋体" w:cs="宋体" w:eastAsia="宋体" w:hAnsi="宋体"/>
+                <w:sz w:val="21"/>
+                <w:szCs w:val="21"/>
+              </w:rPr>
+              <w:t xml:space="preserve">（2）跨模态对齐机制。采用跨模态注意力实现不同物理信号之间的特征对齐。以超声-位姿交互为例：A_{up} = softmax(Q_u · K_pᵀ / √d) · V_p，其中Q_u = f_u · W_Q，K_p = f_p · W_K，V_p = f_p · W_V。类似地计算超声-视觉交互A_{uv}。最终融合表示为 f_fused = [A_{up}; A_{uv}]，通过拼接实现多模态信息整合。该机制使模型能够自动学习不同模态之间的互补关系，例如当超声信号受干扰时，增加视觉和位姿模态的权重。</w:t>
+            </w:r>
+          </w:p>
+          <w:p>
+            <w:pPr>
+              <w:spacing w:after="0" w:before="0" w:line="360"/>
+              <w:ind w:firstLine="420"/>
+              <w:jc w:val="left"/>
+            </w:pPr>
+            <w:r>
+              <w:rPr>
+                <w:rFonts w:ascii="宋体" w:cs="宋体" w:eastAsia="宋体" w:hAnsi="宋体"/>
+                <w:sz w:val="21"/>
+                <w:szCs w:val="21"/>
+              </w:rPr>
+              <w:t xml:space="preserve">（3）时序建模。对融合序列进行时序建模：h_t = Transformer(f_fused(t-T:t))，其中T为时间窗口长度。Transformer通过多头注意力机制捕捉全局时间依赖关系，MultiHead(Q,K,V) = Concat(head_1,...,head_h)·W^O，其中head_i = Attention(Q·W_i^Q, K·W_i^K, V·W_i^V)。输出当前状态向量h_t ∈ ℝ^{d_model}，用于后续接触状态判定。时序建模能够捕捉接触状态的动态演化规律，为状态转移约束提供基础。</w:t>
             </w:r>
           </w:p>
           <w:p>
@@ -903,22 +1036,7 @@
                 <w:sz w:val="21"/>
                 <w:szCs w:val="21"/>
               </w:rPr>
-              <w:t xml:space="preserve">3.3 状态转移约束模型</w:t>
-            </w:r>
-          </w:p>
-          <w:p>
-            <w:pPr>
-              <w:spacing w:after="0" w:before="0" w:line="360"/>
-              <w:ind w:firstLine="420"/>
-              <w:jc w:val="left"/>
-            </w:pPr>
-            <w:r>
-              <w:rPr>
-                <w:rFonts w:ascii="宋体" w:cs="宋体" w:eastAsia="宋体" w:hAnsi="宋体"/>
-                <w:sz w:val="21"/>
-                <w:szCs w:val="21"/>
-              </w:rPr>
-              <w:t xml:space="preserve">将接触状态建模为隐马尔可夫过程，引入状态转移概率P(s_t|s_{t-1})和平滑约束，避免频繁状态跳变。考虑采用CRF（条件随机场）结构进行约束推断，保证状态演化符合实际接触物理过程。</w:t>
+              <w:t xml:space="preserve">3.3 物理约束注意力机制</w:t>
             </w:r>
           </w:p>
           <w:p>
@@ -937,7 +1055,81 @@
           </w:p>
           <w:p>
             <w:pPr>
-              <w:spacing w:after="0" w:before="120" w:line="360"/>
+              <w:spacing w:after="0" w:before="0" w:line="360"/>
+              <w:ind w:firstLine="420"/>
+              <w:jc w:val="left"/>
+            </w:pPr>
+            <w:r>
+              <w:rPr>
+                <w:rFonts w:ascii="宋体" w:cs="宋体" w:eastAsia="宋体" w:hAnsi="宋体"/>
+                <w:sz w:val="21"/>
+                <w:szCs w:val="21"/>
+              </w:rPr>
+              <w:t xml:space="preserve">传统Transformer的自注意力权重仅由特征相似度决定，缺乏物理可解释性。为增强物理一致性，本研究在自注意力计算中引入物理约束矩阵P，将无人机动力学模型与接触物理先验嵌入特征交互过程。该方法的核心思想是：让模型不仅从数据中学习模式，还要遵循物理规律。</w:t>
+            </w:r>
+          </w:p>
+          <w:p>
+            <w:pPr>
+              <w:spacing w:after="0" w:before="0" w:line="360"/>
+              <w:ind w:firstLine="420"/>
+              <w:jc w:val="left"/>
+            </w:pPr>
+            <w:r>
+              <w:rPr>
+                <w:rFonts w:ascii="宋体" w:cs="宋体" w:eastAsia="宋体" w:hAnsi="宋体"/>
+                <w:sz w:val="21"/>
+                <w:szCs w:val="21"/>
+              </w:rPr>
+              <w:t xml:space="preserve">（1）物理约束矩阵构造。基于无人机动力学模型构造约束项。平移运动模型：m·a = F_thrust - mg - F_drag，其中m为质量，a为加速度，F_thrust为推力，F_drag为空气阻力（与速度平方成正比）。姿态变化模型：I·α = τ - τ_disturbance，其中I为转动惯量，α为角加速度，τ为控制力矩，τ_disturbance为扰动力矩。这两个方程描述了无人机在自由飞行状态下的动力学行为，当接触发生时，需要额外考虑接触力的影响。</w:t>
+            </w:r>
+          </w:p>
+          <w:p>
+            <w:pPr>
+              <w:spacing w:after="0" w:before="0" w:line="360"/>
+              <w:ind w:firstLine="420"/>
+              <w:jc w:val="left"/>
+            </w:pPr>
+            <w:r>
+              <w:rPr>
+                <w:rFonts w:ascii="宋体" w:cs="宋体" w:eastAsia="宋体" w:hAnsi="宋体"/>
+                <w:sz w:val="21"/>
+                <w:szCs w:val="21"/>
+              </w:rPr>
+              <w:t xml:space="preserve">（2）接触物理先验。当探头与被测表面发生接触时，法向力F_n会突变，导致无人机速度变化||Δv_t|| ≈ 0（因接触约束），而加速度||a_t||显著变化。基于该物理先验，构造约束项：P_ij = exp(-||r_ij||_dyn²/σ²)，其中||·||_dyn表示动力学残差，σ为温度参数。物理约束矩阵P与原始注意力权重A逐元素相乘，得到物理约束注意力：A_physics = softmax((Q·Kᵀ/√d) ⊙ P) · V。该设计确保注意力权重不仅反映特征相似度，还满足动力学一致性。</w:t>
+            </w:r>
+          </w:p>
+          <w:p>
+            <w:pPr>
+              <w:spacing w:after="0" w:before="0" w:line="360"/>
+              <w:ind w:firstLine="420"/>
+              <w:jc w:val="left"/>
+            </w:pPr>
+            <w:r>
+              <w:rPr>
+                <w:rFonts w:ascii="宋体" w:cs="宋体" w:eastAsia="宋体" w:hAnsi="宋体"/>
+                <w:sz w:val="21"/>
+                <w:szCs w:val="21"/>
+              </w:rPr>
+              <w:t xml:space="preserve">（3）损失函数设计。定义接触预测概率 ŷ = σ(W_o · h_t + b_o)，其中σ为sigmoid函数。物理残差定义为 L_physics = ||m·â - F̂_thrust + mg||²，其中â为网络预测的加速度，F̂_thrust为预测推力。总损失函数为 L = L_CE + λ·L_physics，其中L_CE为接触概率交叉熵损失，λ为物理约束权重系数，可通过交叉验证或自适应调节确定。该设计强制网络输出满足动力学合理性，避免纯数据驱动模型产生违背物理规律的预测。</w:t>
+            </w:r>
+          </w:p>
+          <w:p>
+            <w:pPr>
+              <w:spacing w:after="0" w:before="0" w:line="360"/>
+              <w:jc w:val="left"/>
+            </w:pPr>
+            <w:r>
+              <w:rPr>
+                <w:rFonts w:ascii="宋体" w:cs="宋体" w:eastAsia="宋体" w:hAnsi="宋体"/>
+                <w:sz w:val="21"/>
+                <w:szCs w:val="21"/>
+              </w:rPr>
+              <w:t xml:space="preserve"/>
+            </w:r>
+          </w:p>
+          <w:p>
+            <w:pPr>
+              <w:spacing w:after="0" w:before="60" w:line="360"/>
               <w:jc w:val="left"/>
             </w:pPr>
             <w:r>
@@ -948,6 +1140,155 @@
                 <w:sz w:val="21"/>
                 <w:szCs w:val="21"/>
               </w:rPr>
+              <w:t xml:space="preserve">3.4 状态转移约束模型</w:t>
+            </w:r>
+          </w:p>
+          <w:p>
+            <w:pPr>
+              <w:spacing w:after="0" w:before="0" w:line="360"/>
+              <w:jc w:val="left"/>
+            </w:pPr>
+            <w:r>
+              <w:rPr>
+                <w:rFonts w:ascii="宋体" w:cs="宋体" w:eastAsia="宋体" w:hAnsi="宋体"/>
+                <w:sz w:val="21"/>
+                <w:szCs w:val="21"/>
+              </w:rPr>
+              <w:t xml:space="preserve"/>
+            </w:r>
+          </w:p>
+          <w:p>
+            <w:pPr>
+              <w:spacing w:after="0" w:before="0" w:line="360"/>
+              <w:ind w:firstLine="420"/>
+              <w:jc w:val="left"/>
+            </w:pPr>
+            <w:r>
+              <w:rPr>
+                <w:rFonts w:ascii="宋体" w:cs="宋体" w:eastAsia="宋体" w:hAnsi="宋体"/>
+                <w:sz w:val="21"/>
+                <w:szCs w:val="21"/>
+              </w:rPr>
+              <w:t xml:space="preserve">接触状态具有时序连续性特征。传统逐帧分类模型容易出现频繁状态跳变，影响控制决策稳定性。例如，在探头接近被测表面时，可能因微小振动导致分类结果在接触与非接触之间快速切换，这种抖动会传递给控制系统，造成飞行不稳定。本研究引入状态转移约束模型，将接触判定视为隐状态演化过程，通过概率平滑约束抑制瞬时误判。</w:t>
+            </w:r>
+          </w:p>
+          <w:p>
+            <w:pPr>
+              <w:spacing w:after="0" w:before="0" w:line="360"/>
+              <w:ind w:firstLine="420"/>
+              <w:jc w:val="left"/>
+            </w:pPr>
+            <w:r>
+              <w:rPr>
+                <w:rFonts w:ascii="宋体" w:cs="宋体" w:eastAsia="宋体" w:hAnsi="宋体"/>
+                <w:sz w:val="21"/>
+                <w:szCs w:val="21"/>
+              </w:rPr>
+              <w:t xml:space="preserve">（1）隐马尔可夫模型（HMM）。设接触状态s_t ∈ {0, 1}为隐变量，观测向量o_t = h_t为Transformer输出的状态向量。状态转移概率为 P(s_t|s_{t-1})，构成2×2转移矩阵A，其中A_ij = P(s_t=j|s_{t-1}=i)。观测概率为 P(o_t|s_t)，通常建模为高斯分布或神经网络输出。联合概率为 P(s_{1:T}, o_{1:T}) = Π_t P(s_t|s_{t-1})·P(o_t|s_t)。通过Viterbi算法求解最优状态序列：s* = argmax P(s_{1:T}|o_{1:T})。HMM的优势在于能够利用历史信息平滑当前判定，减少瞬时噪声的影响。</w:t>
+            </w:r>
+          </w:p>
+          <w:p>
+            <w:pPr>
+              <w:spacing w:after="0" w:before="0" w:line="360"/>
+              <w:ind w:firstLine="420"/>
+              <w:jc w:val="left"/>
+            </w:pPr>
+            <w:r>
+              <w:rPr>
+                <w:rFonts w:ascii="宋体" w:cs="宋体" w:eastAsia="宋体" w:hAnsi="宋体"/>
+                <w:sz w:val="21"/>
+                <w:szCs w:val="21"/>
+              </w:rPr>
+              <w:t xml:space="preserve">（2）平滑约束。为避免频繁跳变，引入平滑约束项：L_smooth = Σ_t ||s_t - s_{t-1}||²，惩罚相邻时刻的状态变化。该约束与观测概率联合优化，保证状态演化符合实际接触物理过程。在实际应用中，可通过调节平滑权重λ_smooth控制状态变化的灵敏度：λ_smooth越大，状态越稳定，但响应速度越慢；反之亦然。需要根据具体应用场景在稳定性和响应速度之间取得平衡。</w:t>
+            </w:r>
+          </w:p>
+          <w:p>
+            <w:pPr>
+              <w:spacing w:after="0" w:before="0" w:line="360"/>
+              <w:ind w:firstLine="420"/>
+              <w:jc w:val="left"/>
+            </w:pPr>
+            <w:r>
+              <w:rPr>
+                <w:rFonts w:ascii="宋体" w:cs="宋体" w:eastAsia="宋体" w:hAnsi="宋体"/>
+                <w:sz w:val="21"/>
+                <w:szCs w:val="21"/>
+              </w:rPr>
+              <w:t xml:space="preserve">（3）条件随机场（CRF）扩展。考虑采用CRF结构进行约束推断，定义全局归一化的状态序列概率：P(s_{1:T}|o_{1:T}) = exp(Σ_t [ψ(s_t, o_t) + φ(s_t, s_{t-1})]) / Z(o_{1:T})，其中ψ(s_t, o_t)为发射得分函数，衡量状态s_t与观测o_t的匹配程度；φ(s_t, s_{t-1})为转移得分函数，衡量相邻状态的转移合理性；Z(o_{1:T})为配分函数，确保概率归一化。CRF能够建模全局依赖关系，避免HMM的独立性假设限制，进一步提升状态判定的连续性与稳定性。与HMM相比，CRF不需要假设观测独立，能够更灵活地建模复杂依赖关系。</w:t>
+            </w:r>
+          </w:p>
+          <w:p>
+            <w:pPr>
+              <w:spacing w:after="0" w:before="0" w:line="360"/>
+              <w:jc w:val="left"/>
+            </w:pPr>
+            <w:r>
+              <w:rPr>
+                <w:rFonts w:ascii="宋体" w:cs="宋体" w:eastAsia="宋体" w:hAnsi="宋体"/>
+                <w:sz w:val="21"/>
+                <w:szCs w:val="21"/>
+              </w:rPr>
+              <w:t xml:space="preserve"/>
+            </w:r>
+          </w:p>
+          <w:p>
+            <w:pPr>
+              <w:spacing w:after="0" w:before="60" w:line="360"/>
+              <w:jc w:val="left"/>
+            </w:pPr>
+            <w:r>
+              <w:rPr>
+                <w:rFonts w:ascii="宋体" w:cs="宋体" w:eastAsia="宋体" w:hAnsi="宋体"/>
+                <w:b/>
+                <w:bCs/>
+                <w:sz w:val="21"/>
+                <w:szCs w:val="21"/>
+              </w:rPr>
+              <w:t xml:space="preserve">3.5 理论框架总结</w:t>
+            </w:r>
+          </w:p>
+          <w:p>
+            <w:pPr>
+              <w:spacing w:after="0" w:before="0" w:line="360"/>
+              <w:jc w:val="left"/>
+            </w:pPr>
+            <w:r>
+              <w:rPr>
+                <w:rFonts w:ascii="宋体" w:cs="宋体" w:eastAsia="宋体" w:hAnsi="宋体"/>
+                <w:sz w:val="21"/>
+                <w:szCs w:val="21"/>
+              </w:rPr>
+              <w:t xml:space="preserve"/>
+            </w:r>
+          </w:p>
+          <w:p>
+            <w:pPr>
+              <w:spacing w:after="0" w:before="0" w:line="360"/>
+              <w:ind w:firstLine="420"/>
+              <w:jc w:val="left"/>
+            </w:pPr>
+            <w:r>
+              <w:rPr>
+                <w:rFonts w:ascii="宋体" w:cs="宋体" w:eastAsia="宋体" w:hAnsi="宋体"/>
+                <w:sz w:val="21"/>
+                <w:szCs w:val="21"/>
+              </w:rPr>
+              <w:t xml:space="preserve">上述理论框架形成从信号采集到状态判定的完整链路：EMAT理论提供超声回波的物理基础，多模态时序建模框架实现异构传感器数据的统一表征，物理约束注意力机制将动力学先验嵌入特征交互过程，状态转移约束模型保证判定结果的时序连续性。四层理论逐级施加约束，从底层信号物理到顶层决策逻辑形成闭环，为无人机自主电磁超声探测提供系统化的理论支撑。该理论框架的核心创新在于：将物理先验与数据驱动方法有机结合，既保留了深度学习的特征提取能力，又确保了输出的物理合理性。</w:t>
+            </w:r>
+          </w:p>
+          <w:p>
+            <w:pPr>
+              <w:spacing w:after="0" w:before="120" w:line="360"/>
+              <w:jc w:val="left"/>
+            </w:pPr>
+            <w:r>
+              <w:rPr>
+                <w:rFonts w:ascii="宋体" w:cs="宋体" w:eastAsia="宋体" w:hAnsi="宋体"/>
+                <w:b/>
+                <w:bCs/>
+                <w:sz w:val="21"/>
+                <w:szCs w:val="21"/>
+              </w:rPr>
               <w:t xml:space="preserve">4、下一步工作计划</w:t>
             </w:r>
           </w:p>
@@ -1121,22 +1462,22 @@
                 <w:sz w:val="21"/>
                 <w:szCs w:val="21"/>
               </w:rPr>
-              <w:t xml:space="preserve">（1）完成EMAT电磁超声探头制作、调试与ROS驱动开发，实现40Hz稳定波形采集；</w:t>
-            </w:r>
-          </w:p>
-          <w:p>
-            <w:pPr>
-              <w:spacing w:after="0" w:before="0" w:line="360"/>
-              <w:ind w:firstLine="420"/>
-              <w:jc w:val="left"/>
-            </w:pPr>
-            <w:r>
-              <w:rPr>
-                <w:rFonts w:ascii="宋体" w:cs="宋体" w:eastAsia="宋体" w:hAnsi="宋体"/>
-                <w:sz w:val="21"/>
-                <w:szCs w:val="21"/>
-              </w:rPr>
-              <w:t xml:space="preserve">（2）完成无人机实验平台搭建，集成LiDAR、RGBD相机、PX4飞控，实现自主飞行与多模态数据同步采集。</w:t>
+              <w:t xml:space="preserve">（1）完成EMAT探头制作、调试与ROS驱动开发，实现40 Hz稳定波形采集；</w:t>
+            </w:r>
+          </w:p>
+          <w:p>
+            <w:pPr>
+              <w:spacing w:after="0" w:before="0" w:line="360"/>
+              <w:ind w:firstLine="420"/>
+              <w:jc w:val="left"/>
+            </w:pPr>
+            <w:r>
+              <w:rPr>
+                <w:rFonts w:ascii="宋体" w:cs="宋体" w:eastAsia="宋体" w:hAnsi="宋体"/>
+                <w:sz w:val="21"/>
+                <w:szCs w:val="21"/>
+              </w:rPr>
+              <w:t xml:space="preserve">（2）完成无人机实验平台搭建，集成LiDAR、RGBD相机与PX4飞控，实现自主飞行与多模态数据同步采集。</w:t>
             </w:r>
           </w:p>
           <w:p>
@@ -1181,22 +1522,22 @@
                 <w:sz w:val="21"/>
                 <w:szCs w:val="21"/>
               </w:rPr>
-              <w:t xml:space="preserve">（1）开发EMAT ROS驱动节点（C++17），支持二进制协议通信、自动重连、Qt5波形可视化；</w:t>
-            </w:r>
-          </w:p>
-          <w:p>
-            <w:pPr>
-              <w:spacing w:after="0" w:before="0" w:line="360"/>
-              <w:ind w:firstLine="420"/>
-              <w:jc w:val="left"/>
-            </w:pPr>
-            <w:r>
-              <w:rPr>
-                <w:rFonts w:ascii="宋体" w:cs="宋体" w:eastAsia="宋体" w:hAnsi="宋体"/>
-                <w:sz w:val="21"/>
-                <w:szCs w:val="21"/>
-              </w:rPr>
-              <w:t xml:space="preserve">（2）开发视觉引导自主规划程序，实现目标选取→路径规划→精确接近的完整流程；</w:t>
+              <w:t xml:space="preserve">（1）开发EMAT ROS驱动节点（C++17），支持二进制协议通信、自动重连与Qt5波形可视化；</w:t>
+            </w:r>
+          </w:p>
+          <w:p>
+            <w:pPr>
+              <w:spacing w:after="0" w:before="0" w:line="360"/>
+              <w:ind w:firstLine="420"/>
+              <w:jc w:val="left"/>
+            </w:pPr>
+            <w:r>
+              <w:rPr>
+                <w:rFonts w:ascii="宋体" w:cs="宋体" w:eastAsia="宋体" w:hAnsi="宋体"/>
+                <w:sz w:val="21"/>
+                <w:szCs w:val="21"/>
+              </w:rPr>
+              <w:t xml:space="preserve">（2）开发视觉引导自主规划程序，实现目标选取、路径规划与精确接近的完整流程；</w:t>
             </w:r>
           </w:p>
           <w:p>
@@ -2425,6 +2766,2771 @@
 
 <file path=word/comments.xml><?xml version="1.0" encoding="utf-8"?>
 <w:comments xmlns:cx="http://schemas.microsoft.com/office/drawing/2014/chartex" xmlns:cx1="http://schemas.microsoft.com/office/drawing/2015/9/8/chartex" xmlns:cx2="http://schemas.microsoft.com/office/drawing/2015/10/21/chartex" xmlns:cx3="http://schemas.microsoft.com/office/drawing/2016/5/9/chartex" xmlns:cx4="http://schemas.microsoft.com/office/drawing/2016/5/10/chartex" xmlns:cx5="http://schemas.microsoft.com/office/drawing/2016/5/11/chartex" xmlns:cx6="http://schemas.microsoft.com/office/drawing/2016/5/12/chartex" xmlns:cx7="http://schemas.microsoft.com/office/drawing/2016/5/13/chartex" xmlns:cx8="http://schemas.microsoft.com/office/drawing/2016/5/14/chartex" xmlns:mc="http://schemas.openxmlformats.org/markup-compatibility/2006" xmlns:aink="http://schemas.microsoft.com/office/drawing/2016/ink" xmlns:am3d="http://schemas.microsoft.com/office/drawing/2017/model3d" xmlns:o="urn:schemas-microsoft-com:office:office" xmlns:r="http://schemas.openxmlformats.org/officeDocument/2006/relationships" xmlns:m="http://schemas.openxmlformats.org/officeDocument/2006/math" xmlns:v="urn:schemas-microsoft-com:vml" xmlns:wp14="http://schemas.microsoft.com/office/word/2010/wordprocessingDrawing" xmlns:wp="http://schemas.openxmlformats.org/drawingml/2006/wordprocessingDrawing" xmlns:w10="urn:schemas-microsoft-com:office:word" xmlns:w="http://schemas.openxmlformats.org/wordprocessingml/2006/main" xmlns:w14="http://schemas.microsoft.com/office/word/2010/wordml" xmlns:w15="http://schemas.microsoft.com/office/word/2012/wordml" xmlns:w16cex="http://schemas.microsoft.com/office/word/2018/wordml/cex" xmlns:w16cid="http://schemas.microsoft.com/office/word/2016/wordml/cid" xmlns:w16="http://schemas.microsoft.com/office/word/2018/wordml" xmlns:w16sdtdh="http://schemas.microsoft.com/office/word/2020/wordml/sdtdatahash" xmlns:w16se="http://schemas.microsoft.com/office/word/2015/wordml/symex" xmlns:wpg="http://schemas.microsoft.com/office/word/2010/wordprocessingGroup" xmlns:wpi="http://schemas.microsoft.com/office/word/2010/wordprocessingInk" xmlns:wne="http://schemas.microsoft.com/office/word/2006/wordml" xmlns:wps="http://schemas.microsoft.com/office/word/2010/wordprocessingShape"/>
+</file>
+
+<file path=word/document_pp.xml><?xml version="1.0" encoding="utf-8"?>
+<w:document xmlns:wpc="http://schemas.microsoft.com/office/word/2010/wordprocessingCanvas" xmlns:mc="http://schemas.openxmlformats.org/markup-compatibility/2006" xmlns:o="urn:schemas-microsoft-com:office:office" xmlns:r="http://schemas.openxmlformats.org/officeDocument/2006/relationships" xmlns:m="http://schemas.openxmlformats.org/officeDocument/2006/math" xmlns:v="urn:schemas-microsoft-com:vml" xmlns:wp14="http://schemas.microsoft.com/office/word/2010/wordprocessingDrawing" xmlns:wp="http://schemas.openxmlformats.org/drawingml/2006/wordprocessingDrawing" xmlns:w10="urn:schemas-microsoft-com:office:word" xmlns:w="http://schemas.openxmlformats.org/wordprocessingml/2006/main" xmlns:w14="http://schemas.microsoft.com/office/word/2010/wordml" xmlns:w15="http://schemas.microsoft.com/office/word/2012/wordml" xmlns:wpg="http://schemas.microsoft.com/office/word/2010/wordprocessingGroup" xmlns:wpi="http://schemas.microsoft.com/office/word/2010/wordprocessingInk" xmlns:wne="http://schemas.microsoft.com/office/word/2006/wordml" xmlns:wps="http://schemas.microsoft.com/office/word/2010/wordprocessingShape" xmlns:cx="http://schemas.microsoft.com/office/drawing/2014/chartex" xmlns:cx1="http://schemas.microsoft.com/office/drawing/2015/9/8/chartex" xmlns:cx2="http://schemas.microsoft.com/office/drawing/2015/10/21/chartex" xmlns:cx3="http://schemas.microsoft.com/office/drawing/2016/5/9/chartex" xmlns:cx4="http://schemas.microsoft.com/office/drawing/2016/5/10/chartex" xmlns:cx5="http://schemas.microsoft.com/office/drawing/2016/5/11/chartex" xmlns:cx6="http://schemas.microsoft.com/office/drawing/2016/5/12/chartex" xmlns:cx7="http://schemas.microsoft.com/office/drawing/2016/5/13/chartex" xmlns:cx8="http://schemas.microsoft.com/office/drawing/2016/5/14/chartex" xmlns:aink="http://schemas.microsoft.com/office/drawing/2016/ink" xmlns:am3d="http://schemas.microsoft.com/office/drawing/2017/model3d" xmlns:w16cex="http://schemas.microsoft.com/office/word/2018/wordml/cex" xmlns:w16cid="http://schemas.microsoft.com/office/word/2016/wordml/cid" xmlns:w16="http://schemas.microsoft.com/office/word/2018/wordml" xmlns:w16sdtdh="http://schemas.microsoft.com/office/word/2020/wordml/sdtdatahash" xmlns:w16se="http://schemas.microsoft.com/office/word/2015/wordml/symex" mc:Ignorable="w14 w15 wp14">
+  <w:body>
+    <w:p>
+      <w:pPr>
+        <w:spacing w:after="0" w:before="0" w:line="360"/>
+        <w:jc w:val="center"/>
+      </w:pPr>
+      <w:r>
+        <w:rPr>
+          <w:rFonts w:ascii="宋体" w:cs="宋体" w:eastAsia="宋体" w:hAnsi="宋体"/>
+          <w:b/>
+          <w:bCs/>
+          <w:sz w:val="36"/>
+          <w:szCs w:val="36"/>
+        </w:rPr>
+        <w:t xml:space="preserve">电 子 科 技 大 学</w:t>
+      </w:r>
+    </w:p>
+    <w:p>
+      <w:pPr>
+        <w:spacing w:after="240" w:before="120" w:line="360"/>
+        <w:jc w:val="center"/>
+      </w:pPr>
+      <w:r>
+        <w:rPr>
+          <w:rFonts w:ascii="宋体" w:cs="宋体" w:eastAsia="宋体" w:hAnsi="宋体"/>
+          <w:b/>
+          <w:bCs/>
+          <w:sz w:val="28"/>
+          <w:szCs w:val="28"/>
+        </w:rPr>
+        <w:t xml:space="preserve">学术学位研究生学位论文中期考评表</w:t>
+      </w:r>
+    </w:p>
+    <w:p>
+      <w:pPr>
+        <w:spacing w:after="0" w:before="0" w:line="360"/>
+        <w:jc w:val="left"/>
+      </w:pPr>
+      <w:r>
+        <w:rPr>
+          <w:rFonts w:ascii="宋体" w:cs="宋体" w:eastAsia="宋体" w:hAnsi="宋体"/>
+          <w:sz w:val="21"/>
+          <w:szCs w:val="21"/>
+        </w:rPr>
+        <w:t xml:space="preserve">	攻读学位级别： □博士        </w:t>
+      </w:r>
+      <w:r>
+        <w:rPr>
+          <w:rFonts w:ascii="宋体" w:cs="宋体" w:eastAsia="宋体" w:hAnsi="宋体"/>
+          <w:b/>
+          <w:bCs/>
+          <w:sz w:val="21"/>
+          <w:szCs w:val="21"/>
+        </w:rPr>
+        <w:t xml:space="preserve">硕士</w:t>
+      </w:r>
+    </w:p>
+    <w:p>
+      <w:pPr>
+        <w:spacing w:after="0" w:before="0" w:line="360"/>
+        <w:jc w:val="left"/>
+      </w:pPr>
+      <w:r>
+        <w:rPr>
+          <w:rFonts w:ascii="宋体" w:cs="宋体" w:eastAsia="宋体" w:hAnsi="宋体"/>
+          <w:sz w:val="21"/>
+          <w:szCs w:val="21"/>
+        </w:rPr>
+        <w:t xml:space="preserve">	学科专业：      控制科学与工程       </w:t>
+      </w:r>
+    </w:p>
+    <w:p>
+      <w:pPr>
+        <w:spacing w:after="0" w:before="0" w:line="360"/>
+        <w:jc w:val="left"/>
+      </w:pPr>
+      <w:r>
+        <w:rPr>
+          <w:rFonts w:ascii="宋体" w:cs="宋体" w:eastAsia="宋体" w:hAnsi="宋体"/>
+          <w:sz w:val="21"/>
+          <w:szCs w:val="21"/>
+        </w:rPr>
+        <w:t xml:space="preserve">	学        院：      自动化工程学院       </w:t>
+      </w:r>
+    </w:p>
+    <w:p>
+      <w:pPr>
+        <w:spacing w:after="0" w:before="0" w:line="360"/>
+        <w:jc w:val="left"/>
+      </w:pPr>
+      <w:r>
+        <w:rPr>
+          <w:rFonts w:ascii="宋体" w:cs="宋体" w:eastAsia="宋体" w:hAnsi="宋体"/>
+          <w:sz w:val="21"/>
+          <w:szCs w:val="21"/>
+        </w:rPr>
+        <w:t xml:space="preserve">	学        号：       202421060724        </w:t>
+      </w:r>
+    </w:p>
+    <w:p>
+      <w:pPr>
+        <w:spacing w:after="0" w:before="0" w:line="360"/>
+        <w:jc w:val="left"/>
+      </w:pPr>
+      <w:r>
+        <w:rPr>
+          <w:rFonts w:ascii="宋体" w:cs="宋体" w:eastAsia="宋体" w:hAnsi="宋体"/>
+          <w:sz w:val="21"/>
+          <w:szCs w:val="21"/>
+        </w:rPr>
+        <w:t xml:space="preserve">	姓        名：           华羽霄          </w:t>
+      </w:r>
+    </w:p>
+    <w:p>
+      <w:pPr>
+        <w:spacing w:after="0" w:before="0" w:line="360"/>
+        <w:jc w:val="left"/>
+      </w:pPr>
+      <w:r>
+        <w:rPr>
+          <w:rFonts w:ascii="宋体" w:cs="宋体" w:eastAsia="宋体" w:hAnsi="宋体"/>
+          <w:sz w:val="21"/>
+          <w:szCs w:val="21"/>
+        </w:rPr>
+        <w:t xml:space="preserve">	论文题目：  基于多模态逐级物理约束的</w:t>
+      </w:r>
+    </w:p>
+    <w:p>
+      <w:pPr>
+        <w:spacing w:after="0" w:before="0" w:line="360"/>
+        <w:jc w:val="left"/>
+      </w:pPr>
+      <w:r>
+        <w:rPr>
+          <w:rFonts w:ascii="宋体" w:cs="宋体" w:eastAsia="宋体" w:hAnsi="宋体"/>
+          <w:sz w:val="21"/>
+          <w:szCs w:val="21"/>
+        </w:rPr>
+        <w:t xml:space="preserve">	                   无人机自主电磁超声探测技术研究    </w:t>
+      </w:r>
+    </w:p>
+    <w:p>
+      <w:pPr>
+        <w:spacing w:after="0" w:before="0" w:line="360"/>
+        <w:jc w:val="left"/>
+      </w:pPr>
+      <w:r>
+        <w:rPr>
+          <w:rFonts w:ascii="宋体" w:cs="宋体" w:eastAsia="宋体" w:hAnsi="宋体"/>
+          <w:sz w:val="21"/>
+          <w:szCs w:val="21"/>
+        </w:rPr>
+        <w:t xml:space="preserve">	指导教师：        高斌  教授         </w:t>
+      </w:r>
+    </w:p>
+    <w:p>
+      <w:pPr>
+        <w:spacing w:after="120" w:before="0" w:line="360"/>
+        <w:jc w:val="left"/>
+      </w:pPr>
+      <w:r>
+        <w:rPr>
+          <w:rFonts w:ascii="宋体" w:cs="宋体" w:eastAsia="宋体" w:hAnsi="宋体"/>
+          <w:sz w:val="21"/>
+          <w:szCs w:val="21"/>
+        </w:rPr>
+        <w:t xml:space="preserve">	填表日期：  2026  年   5  月   27   日</w:t>
+      </w:r>
+    </w:p>
+    <w:p>
+      <w:pPr>
+        <w:spacing w:after="240" w:before="120" w:line="360"/>
+        <w:jc w:val="center"/>
+      </w:pPr>
+      <w:r>
+        <w:rPr>
+          <w:rFonts w:ascii="宋体" w:cs="宋体" w:eastAsia="宋体" w:hAnsi="宋体"/>
+          <w:sz w:val="21"/>
+          <w:szCs w:val="21"/>
+        </w:rPr>
+        <w:t xml:space="preserve">电子科技大学研究生院</w:t>
+      </w:r>
+    </w:p>
+    <w:p>
+      <w:pPr>
+        <w:spacing w:after="120" w:before="120" w:line="360"/>
+        <w:jc w:val="center"/>
+      </w:pPr>
+      <w:r>
+        <w:rPr>
+          <w:rFonts w:ascii="宋体" w:cs="宋体" w:eastAsia="宋体" w:hAnsi="宋体"/>
+          <w:b/>
+          <w:bCs/>
+          <w:sz w:val="24"/>
+          <w:szCs w:val="24"/>
+        </w:rPr>
+        <w:t xml:space="preserve">已完成的主要工作</w:t>
+      </w:r>
+    </w:p>
+    <w:tbl>
+      <w:tblPr>
+        <w:tblW w:type="dxa" w:w="9000"/>
+        <w:tblBorders>
+          <w:top w:val="single" w:color="auto" w:sz="4"/>
+          <w:left w:val="single" w:color="auto" w:sz="4"/>
+          <w:bottom w:val="single" w:color="auto" w:sz="4"/>
+          <w:right w:val="single" w:color="auto" w:sz="4"/>
+          <w:insideH w:val="single" w:color="auto" w:sz="4"/>
+          <w:insideV w:val="single" w:color="auto" w:sz="4"/>
+        </w:tblBorders>
+      </w:tblPr>
+      <w:tblGrid>
+        <w:gridCol w:w="9000"/>
+      </w:tblGrid>
+      <w:tr>
+        <w:tc>
+          <w:tcPr>
+            <w:tcBorders>
+              <w:top w:val="single" w:color="000000" w:sz="1"/>
+              <w:left w:val="single" w:color="000000" w:sz="1"/>
+              <w:bottom w:val="single" w:color="000000" w:sz="1"/>
+              <w:right w:val="single" w:color="000000" w:sz="1"/>
+            </w:tcBorders>
+            <w:tcMar>
+              <w:top w:type="dxa" w:w="60"/>
+              <w:left w:type="dxa" w:w="80"/>
+              <w:bottom w:type="dxa" w:w="60"/>
+              <w:right w:type="dxa" w:w="80"/>
+            </w:tcMar>
+            <w:vAlign w:val="center"/>
+          </w:tcPr>
+          <w:p>
+            <w:pPr>
+              <w:spacing w:after="0" w:before="0" w:line="360"/>
+              <w:jc w:val="left"/>
+            </w:pPr>
+            <w:r>
+              <w:rPr>
+                <w:rFonts w:ascii="宋体" w:cs="宋体" w:eastAsia="宋体" w:hAnsi="宋体"/>
+                <w:sz w:val="21"/>
+                <w:szCs w:val="21"/>
+              </w:rPr>
+              <w:t xml:space="preserve">1.开题报告通过时间：</w:t>
+            </w:r>
+            <w:r>
+              <w:rPr>
+                <w:rFonts w:ascii="宋体" w:cs="宋体" w:eastAsia="宋体" w:hAnsi="宋体"/>
+                <w:sz w:val="21"/>
+                <w:szCs w:val="21"/>
+              </w:rPr>
+              <w:t xml:space="preserve"> 2026 </w:t>
+            </w:r>
+            <w:r>
+              <w:rPr>
+                <w:rFonts w:ascii="宋体" w:cs="宋体" w:eastAsia="宋体" w:hAnsi="宋体"/>
+                <w:sz w:val="21"/>
+                <w:szCs w:val="21"/>
+              </w:rPr>
+              <w:t xml:space="preserve"> 年 </w:t>
+            </w:r>
+            <w:r>
+              <w:rPr>
+                <w:rFonts w:ascii="宋体" w:cs="宋体" w:eastAsia="宋体" w:hAnsi="宋体"/>
+                <w:sz w:val="21"/>
+                <w:szCs w:val="21"/>
+              </w:rPr>
+              <w:t xml:space="preserve"> 2 </w:t>
+            </w:r>
+            <w:r>
+              <w:rPr>
+                <w:rFonts w:ascii="宋体" w:cs="宋体" w:eastAsia="宋体" w:hAnsi="宋体"/>
+                <w:sz w:val="21"/>
+                <w:szCs w:val="21"/>
+              </w:rPr>
+              <w:t xml:space="preserve"> 月 </w:t>
+            </w:r>
+            <w:r>
+              <w:rPr>
+                <w:rFonts w:ascii="宋体" w:cs="宋体" w:eastAsia="宋体" w:hAnsi="宋体"/>
+                <w:sz w:val="21"/>
+                <w:szCs w:val="21"/>
+              </w:rPr>
+              <w:t xml:space="preserve"> 25 </w:t>
+            </w:r>
+            <w:r>
+              <w:rPr>
+                <w:rFonts w:ascii="宋体" w:cs="宋体" w:eastAsia="宋体" w:hAnsi="宋体"/>
+                <w:sz w:val="21"/>
+                <w:szCs w:val="21"/>
+              </w:rPr>
+              <w:t xml:space="preserve"> 日</w:t>
+            </w:r>
+          </w:p>
+        </w:tc>
+      </w:tr>
+      <w:tr>
+        <w:tc>
+          <w:tcPr>
+            <w:tcBorders>
+              <w:top w:val="single" w:color="000000" w:sz="1"/>
+              <w:left w:val="single" w:color="000000" w:sz="1"/>
+              <w:bottom w:val="single" w:color="000000" w:sz="1"/>
+              <w:right w:val="single" w:color="000000" w:sz="1"/>
+            </w:tcBorders>
+            <w:tcMar>
+              <w:top w:type="dxa" w:w="60"/>
+              <w:left w:type="dxa" w:w="80"/>
+              <w:bottom w:type="dxa" w:w="60"/>
+              <w:right w:type="dxa" w:w="80"/>
+            </w:tcMar>
+            <w:vAlign w:val="center"/>
+          </w:tcPr>
+          <w:p>
+            <w:pPr>
+              <w:spacing w:after="0" w:before="0" w:line="360"/>
+              <w:jc w:val="left"/>
+            </w:pPr>
+            <w:r>
+              <w:rPr>
+                <w:rFonts w:ascii="宋体" w:cs="宋体" w:eastAsia="宋体" w:hAnsi="宋体"/>
+                <w:b/>
+                <w:bCs/>
+                <w:sz w:val="21"/>
+                <w:szCs w:val="21"/>
+              </w:rPr>
+              <w:t xml:space="preserve">2. 课程学习情况</w:t>
+            </w:r>
+          </w:p>
+        </w:tc>
+      </w:tr>
+      <w:tr>
+        <w:tc>
+          <w:tcPr>
+            <w:tcBorders>
+              <w:top w:val="single" w:color="000000" w:sz="1"/>
+              <w:left w:val="single" w:color="000000" w:sz="1"/>
+              <w:bottom w:val="single" w:color="000000" w:sz="1"/>
+              <w:right w:val="single" w:color="000000" w:sz="1"/>
+            </w:tcBorders>
+            <w:tcMar>
+              <w:top w:type="dxa" w:w="60"/>
+              <w:left w:type="dxa" w:w="80"/>
+              <w:bottom w:type="dxa" w:w="60"/>
+              <w:right w:type="dxa" w:w="80"/>
+            </w:tcMar>
+            <w:vAlign w:val="center"/>
+          </w:tcPr>
+          <w:p>
+            <w:pPr>
+              <w:spacing w:after="0" w:before="0" w:line="360"/>
+              <w:jc w:val="left"/>
+            </w:pPr>
+            <w:r>
+              <w:rPr>
+                <w:rFonts w:ascii="宋体" w:cs="宋体" w:eastAsia="宋体" w:hAnsi="宋体"/>
+                <w:sz w:val="21"/>
+                <w:szCs w:val="21"/>
+              </w:rPr>
+              <w:t xml:space="preserve">是否已达到培养方案规定的学分要求</w:t>
+            </w:r>
+            <w:r>
+              <w:rPr>
+                <w:rFonts w:ascii="宋体" w:cs="宋体" w:eastAsia="宋体" w:hAnsi="宋体"/>
+                <w:sz w:val="21"/>
+                <w:szCs w:val="21"/>
+              </w:rPr>
+              <w:t xml:space="preserve">	</w:t>
+            </w:r>
+            <w:r>
+              <w:rPr>
+                <w:rFonts w:ascii="宋体" w:cs="宋体" w:eastAsia="宋体" w:hAnsi="宋体"/>
+                <w:b/>
+                <w:bCs/>
+                <w:sz w:val="21"/>
+                <w:szCs w:val="21"/>
+              </w:rPr>
+              <w:t xml:space="preserve">是 </w:t>
+            </w:r>
+            <w:r>
+              <w:rPr>
+                <w:rFonts w:ascii="宋体" w:cs="宋体" w:eastAsia="宋体" w:hAnsi="宋体"/>
+                <w:sz w:val="21"/>
+                <w:szCs w:val="21"/>
+              </w:rPr>
+              <w:t xml:space="preserve"> □否</w:t>
+            </w:r>
+          </w:p>
+        </w:tc>
+      </w:tr>
+      <w:tr>
+        <w:tc>
+          <w:tcPr>
+            <w:tcBorders>
+              <w:top w:val="single" w:color="000000" w:sz="1"/>
+              <w:left w:val="single" w:color="000000" w:sz="1"/>
+              <w:bottom w:val="single" w:color="000000" w:sz="1"/>
+              <w:right w:val="single" w:color="000000" w:sz="1"/>
+            </w:tcBorders>
+            <w:tcMar>
+              <w:top w:type="dxa" w:w="60"/>
+              <w:left w:type="dxa" w:w="80"/>
+              <w:bottom w:type="dxa" w:w="60"/>
+              <w:right w:type="dxa" w:w="80"/>
+            </w:tcMar>
+            <w:vAlign w:val="center"/>
+          </w:tcPr>
+          <w:p>
+            <w:pPr>
+              <w:spacing w:after="0" w:before="0" w:line="360"/>
+              <w:jc w:val="left"/>
+            </w:pPr>
+            <w:r>
+              <w:rPr>
+                <w:rFonts w:ascii="宋体" w:cs="宋体" w:eastAsia="宋体" w:hAnsi="宋体"/>
+                <w:b/>
+                <w:bCs/>
+                <w:sz w:val="21"/>
+                <w:szCs w:val="21"/>
+              </w:rPr>
+              <w:t xml:space="preserve">3. 论文研究进展</w:t>
+            </w:r>
+          </w:p>
+        </w:tc>
+      </w:tr>
+      <w:tr>
+        <w:tc>
+          <w:tcPr>
+            <w:tcBorders>
+              <w:top w:val="single" w:color="000000" w:sz="1"/>
+              <w:left w:val="single" w:color="000000" w:sz="1"/>
+              <w:bottom w:val="single" w:color="000000" w:sz="1"/>
+              <w:right w:val="single" w:color="000000" w:sz="1"/>
+            </w:tcBorders>
+            <w:tcMar>
+              <w:top w:type="dxa" w:w="60"/>
+              <w:left w:type="dxa" w:w="80"/>
+              <w:bottom w:type="dxa" w:w="60"/>
+              <w:right w:type="dxa" w:w="80"/>
+            </w:tcMar>
+            <w:vAlign w:val="center"/>
+          </w:tcPr>
+          <w:p>
+            <w:pPr>
+              <w:spacing w:after="0" w:before="0" w:line="360"/>
+              <w:jc w:val="left"/>
+            </w:pPr>
+            <w:r>
+              <w:rPr>
+                <w:rFonts w:ascii="宋体" w:cs="宋体" w:eastAsia="宋体" w:hAnsi="宋体"/>
+                <w:sz w:val="18"/>
+                <w:szCs w:val="18"/>
+              </w:rPr>
+              <w:t xml:space="preserve">从理论分析或计算部分、实验（或实证）工作等方面进行总结（可续页）</w:t>
+            </w:r>
+          </w:p>
+          <w:p>
+            <w:pPr>
+              <w:spacing w:after="0" w:before="0" w:line="360"/>
+              <w:jc w:val="left"/>
+            </w:pPr>
+            <w:r>
+              <w:rPr>
+                <w:rFonts w:ascii="宋体" w:cs="宋体" w:eastAsia="宋体" w:hAnsi="宋体"/>
+                <w:sz w:val="21"/>
+                <w:szCs w:val="21"/>
+              </w:rPr>
+              <w:t xml:space="preserve"/>
+            </w:r>
+          </w:p>
+          <w:p>
+            <w:pPr>
+              <w:spacing w:after="0" w:before="120" w:line="360"/>
+              <w:jc w:val="left"/>
+            </w:pPr>
+            <w:r>
+              <w:rPr>
+                <w:rFonts w:ascii="宋体" w:cs="宋体" w:eastAsia="宋体" w:hAnsi="宋体"/>
+                <w:b/>
+                <w:bCs/>
+                <w:sz w:val="21"/>
+                <w:szCs w:val="21"/>
+              </w:rPr>
+              <w:t xml:space="preserve">1、概述</w:t>
+            </w:r>
+          </w:p>
+          <w:p>
+            <w:pPr>
+              <w:spacing w:after="0" w:before="0" w:line="360"/>
+              <w:ind w:firstLine="420"/>
+              <w:jc w:val="left"/>
+            </w:pPr>
+            <w:r>
+              <w:rPr>
+                <w:rFonts w:ascii="宋体" w:cs="宋体" w:eastAsia="宋体" w:hAnsi="宋体"/>
+                <w:sz w:val="21"/>
+                <w:szCs w:val="21"/>
+              </w:rPr>
+              <w:t xml:space="preserve">本课题面向无人机无损检测中探头接触状态难以精确判定的核心问题，构建融合电磁超声回波、位姿误差及RGBD视觉特征的多模态时序感知模型。自开题以来，课题按计划推进，已完成文献调研、实验平台搭建、EMAT硬件开发及数据采集系统构建等关键工作。当前处于多模态融合算法设计与实验验证阶段。</w:t>
+            </w:r>
+          </w:p>
+          <w:p>
+            <w:pPr>
+              <w:spacing w:after="0" w:before="0" w:line="360"/>
+              <w:jc w:val="left"/>
+            </w:pPr>
+            <w:r>
+              <w:rPr>
+                <w:rFonts w:ascii="宋体" w:cs="宋体" w:eastAsia="宋体" w:hAnsi="宋体"/>
+                <w:sz w:val="21"/>
+                <w:szCs w:val="21"/>
+              </w:rPr>
+              <w:t xml:space="preserve"/>
+            </w:r>
+          </w:p>
+          <w:p>
+            <w:pPr>
+              <w:spacing w:after="0" w:before="120" w:line="360"/>
+              <w:jc w:val="left"/>
+            </w:pPr>
+            <w:r>
+              <w:rPr>
+                <w:rFonts w:ascii="宋体" w:cs="宋体" w:eastAsia="宋体" w:hAnsi="宋体"/>
+                <w:b/>
+                <w:bCs/>
+                <w:sz w:val="21"/>
+                <w:szCs w:val="21"/>
+              </w:rPr>
+              <w:t xml:space="preserve">2、已完成的主要工作</w:t>
+            </w:r>
+          </w:p>
+          <w:p>
+            <w:pPr>
+              <w:spacing w:after="0" w:before="0" w:line="360"/>
+              <w:jc w:val="left"/>
+            </w:pPr>
+            <w:r>
+              <w:rPr>
+                <w:rFonts w:ascii="宋体" w:cs="宋体" w:eastAsia="宋体" w:hAnsi="宋体"/>
+                <w:sz w:val="21"/>
+                <w:szCs w:val="21"/>
+              </w:rPr>
+              <w:t xml:space="preserve"/>
+            </w:r>
+          </w:p>
+          <w:p>
+            <w:pPr>
+              <w:spacing w:after="0" w:before="60" w:line="360"/>
+              <w:jc w:val="left"/>
+            </w:pPr>
+            <w:r>
+              <w:rPr>
+                <w:rFonts w:ascii="宋体" w:cs="宋体" w:eastAsia="宋体" w:hAnsi="宋体"/>
+                <w:b/>
+                <w:bCs/>
+                <w:sz w:val="21"/>
+                <w:szCs w:val="21"/>
+              </w:rPr>
+              <w:t xml:space="preserve">2.1 文献调研与理论框架（2025.07—2025.10）</w:t>
+            </w:r>
+          </w:p>
+          <w:p>
+            <w:pPr>
+              <w:spacing w:after="0" w:before="0" w:line="360"/>
+              <w:ind w:firstLine="420"/>
+              <w:jc w:val="left"/>
+            </w:pPr>
+            <w:r>
+              <w:rPr>
+                <w:rFonts w:ascii="宋体" w:cs="宋体" w:eastAsia="宋体" w:hAnsi="宋体"/>
+                <w:sz w:val="21"/>
+                <w:szCs w:val="21"/>
+              </w:rPr>
+              <w:t xml:space="preserve">系统梳理了三个方向的国内外研究现状：无人机接触式无损检测、电磁超声换能器原理与测厚技术、物理约束神经网络与Transformer架构。共完成32篇文献的阅读与整理，涵盖无人机NDT系统设计（Watson等、Marcellini等、Kocer等）、EMAT测厚方法（Chen、Kubrusly、涂君等）、物理信息神经网络（RAMP-Net、PINNsFormer、MPFusionNet）等核心领域。由此明确三大关键技术问题：单模态检测在动态飞行平台上的局限性、纯数据驱动模型缺乏物理约束导致的泛化不足、接触判定结果的时序抖动。</w:t>
+            </w:r>
+          </w:p>
+          <w:p>
+            <w:pPr>
+              <w:spacing w:after="0" w:before="0" w:line="360"/>
+              <w:jc w:val="left"/>
+            </w:pPr>
+            <w:r>
+              <w:rPr>
+                <w:rFonts w:ascii="宋体" w:cs="宋体" w:eastAsia="宋体" w:hAnsi="宋体"/>
+                <w:sz w:val="21"/>
+                <w:szCs w:val="21"/>
+              </w:rPr>
+              <w:t xml:space="preserve"/>
+            </w:r>
+          </w:p>
+          <w:p>
+            <w:pPr>
+              <w:spacing w:after="0" w:before="60" w:line="360"/>
+              <w:jc w:val="left"/>
+            </w:pPr>
+            <w:r>
+              <w:rPr>
+                <w:rFonts w:ascii="宋体" w:cs="宋体" w:eastAsia="宋体" w:hAnsi="宋体"/>
+                <w:b/>
+                <w:bCs/>
+                <w:sz w:val="21"/>
+                <w:szCs w:val="21"/>
+              </w:rPr>
+              <w:t xml:space="preserve">2.2 无人机实验平台搭建与集成（2025.11—2026.01）</w:t>
+            </w:r>
+          </w:p>
+          <w:p>
+            <w:pPr>
+              <w:spacing w:after="0" w:before="0" w:line="360"/>
+              <w:ind w:firstLine="420"/>
+              <w:jc w:val="left"/>
+            </w:pPr>
+            <w:r>
+              <w:rPr>
+                <w:rFonts w:ascii="宋体" w:cs="宋体" w:eastAsia="宋体" w:hAnsi="宋体"/>
+                <w:sz w:val="21"/>
+                <w:szCs w:val="21"/>
+              </w:rPr>
+              <w:t xml:space="preserve">完成无人机系统平台搭建，集成Livox MID-360激光雷达、Intel RealSense D435深度相机与PX4飞控。通过MAVROS实现飞控与地面计算机通信，利用FAST-LIO 2.0（IEKF + ikd-Tree）提供实时6-DOF位姿估计。开发lidar_to_mavros.py桥接节点，将里程计数据转换为MAVROS视觉位姿反馈。系统已实现遥控下的姿态稳定飞行。</w:t>
+            </w:r>
+          </w:p>
+          <w:p>
+            <w:pPr>
+              <w:spacing w:after="0" w:before="0" w:line="360"/>
+              <w:jc w:val="left"/>
+            </w:pPr>
+            <w:r>
+              <w:rPr>
+                <w:rFonts w:ascii="宋体" w:cs="宋体" w:eastAsia="宋体" w:hAnsi="宋体"/>
+                <w:sz w:val="21"/>
+                <w:szCs w:val="21"/>
+              </w:rPr>
+              <w:t xml:space="preserve"/>
+            </w:r>
+          </w:p>
+          <w:p>
+            <w:pPr>
+              <w:spacing w:after="0" w:before="60" w:line="360"/>
+              <w:jc w:val="left"/>
+            </w:pPr>
+            <w:r>
+              <w:rPr>
+                <w:rFonts w:ascii="宋体" w:cs="宋体" w:eastAsia="宋体" w:hAnsi="宋体"/>
+                <w:b/>
+                <w:bCs/>
+                <w:sz w:val="21"/>
+                <w:szCs w:val="21"/>
+              </w:rPr>
+              <w:t xml:space="preserve">2.3 电磁超声探头硬件开发与调试（2026.02—2026.04）</w:t>
+            </w:r>
+          </w:p>
+          <w:p>
+            <w:pPr>
+              <w:spacing w:after="0" w:before="0" w:line="360"/>
+              <w:ind w:firstLine="420"/>
+              <w:jc w:val="left"/>
+            </w:pPr>
+            <w:r>
+              <w:rPr>
+                <w:rFonts w:ascii="宋体" w:cs="宋体" w:eastAsia="宋体" w:hAnsi="宋体"/>
+                <w:sz w:val="21"/>
+                <w:szCs w:val="21"/>
+              </w:rPr>
+              <w:t xml:space="preserve">完成EMAT探头制作与调试。开发ROS驱动节点，通过USB直连CH346C芯片，以二进制协议（0xAB头，CRC-8校验）实现通信。支持厚度读取、波形采集（4块×8185采样点，8-bit ADC）、参数配置等命令。波形采集频率约40 Hz。开发Qt5 C++可视化工具，采用ring buffer + QTimer架构（25 ms刷新），支持DC去除与RMS显示。通过udev规则实现免sudo访问，具备断线自动重连能力。</w:t>
+            </w:r>
+          </w:p>
+          <w:p>
+            <w:pPr>
+              <w:spacing w:after="0" w:before="0" w:line="360"/>
+              <w:jc w:val="left"/>
+            </w:pPr>
+            <w:r>
+              <w:rPr>
+                <w:rFonts w:ascii="宋体" w:cs="宋体" w:eastAsia="宋体" w:hAnsi="宋体"/>
+                <w:sz w:val="21"/>
+                <w:szCs w:val="21"/>
+              </w:rPr>
+              <w:t xml:space="preserve"/>
+            </w:r>
+          </w:p>
+          <w:p>
+            <w:pPr>
+              <w:spacing w:after="0" w:before="60" w:line="360"/>
+              <w:jc w:val="left"/>
+            </w:pPr>
+            <w:r>
+              <w:rPr>
+                <w:rFonts w:ascii="宋体" w:cs="宋体" w:eastAsia="宋体" w:hAnsi="宋体"/>
+                <w:b/>
+                <w:bCs/>
+                <w:sz w:val="21"/>
+                <w:szCs w:val="21"/>
+              </w:rPr>
+              <w:t xml:space="preserve">2.4 多模态数据采集系统构建</w:t>
+            </w:r>
+          </w:p>
+          <w:p>
+            <w:pPr>
+              <w:spacing w:after="0" w:before="0" w:line="360"/>
+              <w:ind w:firstLine="420"/>
+              <w:jc w:val="left"/>
+            </w:pPr>
+            <w:r>
+              <w:rPr>
+                <w:rFonts w:ascii="宋体" w:cs="宋体" w:eastAsia="宋体" w:hAnsi="宋体"/>
+                <w:sz w:val="21"/>
+                <w:szCs w:val="21"/>
+              </w:rPr>
+              <w:t xml:space="preserve">开发基于视觉ROI的自主规划程序：用户在RGB图像中选取目标区域后，系统完成路径规划与末端精确接近。飞行过程中同步采集位姿、RGBD视频流与EMAT回波信号，构建结构化多模态数据集，为后续模型训练提供数据支撑。</w:t>
+            </w:r>
+          </w:p>
+          <w:p>
+            <w:pPr>
+              <w:spacing w:after="0" w:before="0" w:line="360"/>
+              <w:jc w:val="left"/>
+            </w:pPr>
+            <w:r>
+              <w:rPr>
+                <w:rFonts w:ascii="宋体" w:cs="宋体" w:eastAsia="宋体" w:hAnsi="宋体"/>
+                <w:sz w:val="21"/>
+                <w:szCs w:val="21"/>
+              </w:rPr>
+              <w:t xml:space="preserve"/>
+            </w:r>
+          </w:p>
+          <w:p>
+            <w:pPr>
+              <w:spacing w:after="0" w:before="60" w:line="360"/>
+              <w:jc w:val="left"/>
+            </w:pPr>
+            <w:r>
+              <w:rPr>
+                <w:rFonts w:ascii="宋体" w:cs="宋体" w:eastAsia="宋体" w:hAnsi="宋体"/>
+                <w:b/>
+                <w:bCs/>
+                <w:sz w:val="21"/>
+                <w:szCs w:val="21"/>
+              </w:rPr>
+              <w:t xml:space="preserve">2.5 视觉引导与接触控制验证</w:t>
+            </w:r>
+          </w:p>
+          <w:p>
+            <w:pPr>
+              <w:spacing w:after="0" w:before="0" w:line="360"/>
+              <w:ind w:firstLine="420"/>
+              <w:jc w:val="left"/>
+            </w:pPr>
+            <w:r>
+              <w:rPr>
+                <w:rFonts w:ascii="宋体" w:cs="宋体" w:eastAsia="宋体" w:hAnsi="宋体"/>
+                <w:sz w:val="21"/>
+                <w:szCs w:val="21"/>
+              </w:rPr>
+              <w:t xml:space="preserve">实现无人机完全自动驾驶下的任意曲面稳定接触。采用位置-速度串级PID控制，验证了从视觉引导到接触建立再到稳定扫查的完整流程。</w:t>
+            </w:r>
+          </w:p>
+          <w:p>
+            <w:pPr>
+              <w:spacing w:after="0" w:before="0" w:line="360"/>
+              <w:jc w:val="left"/>
+            </w:pPr>
+            <w:r>
+              <w:rPr>
+                <w:rFonts w:ascii="宋体" w:cs="宋体" w:eastAsia="宋体" w:hAnsi="宋体"/>
+                <w:sz w:val="21"/>
+                <w:szCs w:val="21"/>
+              </w:rPr>
+              <w:t xml:space="preserve"/>
+            </w:r>
+          </w:p>
+          <w:p>
+            <w:pPr>
+              <w:spacing w:after="0" w:before="0" w:line="360"/>
+              <w:jc w:val="left"/>
+            </w:pPr>
+            <w:r>
+              <w:rPr>
+                <w:rFonts w:ascii="宋体" w:cs="宋体" w:eastAsia="宋体" w:hAnsi="宋体"/>
+                <w:b/>
+                <w:bCs/>
+                <w:sz w:val="21"/>
+                <w:szCs w:val="21"/>
+              </w:rPr>
+              <w:t xml:space="preserve">3、理论分析进展</w:t>
+            </w:r>
+          </w:p>
+          <w:p>
+            <w:pPr>
+              <w:spacing w:after="0" w:before="0" w:line="360"/>
+              <w:jc w:val="left"/>
+            </w:pPr>
+            <w:r>
+              <w:rPr>
+                <w:rFonts w:ascii="宋体" w:cs="宋体" w:eastAsia="宋体" w:hAnsi="宋体"/>
+                <w:sz w:val="21"/>
+                <w:szCs w:val="21"/>
+              </w:rPr>
+              <w:t xml:space="preserve"/>
+            </w:r>
+          </w:p>
+          <w:p>
+            <w:pPr>
+              <w:spacing w:after="0" w:before="60" w:line="360"/>
+              <w:jc w:val="left"/>
+            </w:pPr>
+            <w:r>
+              <w:rPr>
+                <w:rFonts w:ascii="宋体" w:cs="宋体" w:eastAsia="宋体" w:hAnsi="宋体"/>
+                <w:b/>
+                <w:bCs/>
+                <w:sz w:val="21"/>
+                <w:szCs w:val="21"/>
+              </w:rPr>
+              <w:t xml:space="preserve">3.1 电磁超声无损检测理论</w:t>
+            </w:r>
+          </w:p>
+          <w:p>
+            <w:pPr>
+              <w:spacing w:after="0" w:before="0" w:line="360"/>
+              <w:jc w:val="left"/>
+            </w:pPr>
+            <w:r>
+              <w:rPr>
+                <w:rFonts w:ascii="宋体" w:cs="宋体" w:eastAsia="宋体" w:hAnsi="宋体"/>
+                <w:sz w:val="21"/>
+                <w:szCs w:val="21"/>
+              </w:rPr>
+              <w:t xml:space="preserve"/>
+            </w:r>
+          </w:p>
+          <w:p>
+            <w:pPr>
+              <w:spacing w:after="0" w:before="0" w:line="360"/>
+              <w:ind w:firstLine="420"/>
+              <w:jc w:val="left"/>
+            </w:pPr>
+            <w:r>
+              <w:rPr>
+                <w:rFonts w:ascii="宋体" w:cs="宋体" w:eastAsia="宋体" w:hAnsi="宋体"/>
+                <w:sz w:val="21"/>
+                <w:szCs w:val="21"/>
+              </w:rPr>
+              <w:t xml:space="preserve">电磁超声检测（EMAT）是一种基于电磁耦合机制的非接触式超声激励与接收技术。其基本原理是在导电材料表面施加交变电磁场，通过洛伦兹力或磁致伸缩效应产生弹性波，并利用感应线圈接收反射波信号。与传统压电超声相比，EMAT无需耦合剂，适用于高温、高速运动等恶劣工况。本节阐述EMAT的理论基础及其在接触状态检测中的应用。</w:t>
+            </w:r>
+          </w:p>
+          <w:p>
+            <w:pPr>
+              <w:spacing w:after="0" w:before="0" w:line="360"/>
+              <w:ind w:firstLine="420"/>
+              <w:jc w:val="left"/>
+            </w:pPr>
+            <w:r>
+              <w:rPr>
+                <w:rFonts w:ascii="宋体" w:cs="宋体" w:eastAsia="宋体" w:hAnsi="宋体"/>
+                <w:sz w:val="21"/>
+                <w:szCs w:val="21"/>
+              </w:rPr>
+              <w:t xml:space="preserve">（1）洛伦兹力激励模型。在导电材料中，交变电流密度J与静磁场B作用产生体力密度f = J × B。其中电流密度满足 J = σ(E + v × B)，σ为电导率，E为电场强度，v为粒子速度。该体力密度作为弹性波的激励源，在材料内部传播形成超声信号。对于EMAT线圈，通入交变电流后在导体表面感应涡流，涡流与永磁体静态磁场耦合产生洛伦兹力，进而激发超声波。该机制决定了EMAT的换能效率与材料电导率、磁场强度密切相关。</w:t>
+            </w:r>
+          </w:p>
+          <w:p>
+            <w:pPr>
+              <w:spacing w:after="0" w:before="0" w:line="360"/>
+              <w:ind w:firstLine="420"/>
+              <w:jc w:val="left"/>
+            </w:pPr>
+            <w:r>
+              <w:rPr>
+                <w:rFonts w:ascii="宋体" w:cs="宋体" w:eastAsia="宋体" w:hAnsi="宋体"/>
+                <w:sz w:val="21"/>
+                <w:szCs w:val="21"/>
+              </w:rPr>
+              <w:t xml:space="preserve">（2）弹性波传播方程。材料内部的超声波传播满足弹性动力学方程：ρ·∂²u/∂t² = ∇·σ + f，其中ρ为密度，u为位移矢量，σ为应力张量，f为体力密度（洛伦兹力）。在各向同性材料中，应力与应变满足胡克定律 σ = C:ε，其中C为四阶弹性张量，ε = (∇u + (∇u)ᵀ)/2 为应变张量。对于纵波，波速c_L = √((λ+2μ)/ρ)；对于横波，波速c_T = √(μ/ρ)，其中λ和μ为拉梅常数。超声波在传播过程中遇到界面会发生反射和折射，反射系数取决于两侧介质的声阻抗差异。</w:t>
+            </w:r>
+          </w:p>
+          <w:p>
+            <w:pPr>
+              <w:spacing w:after="0" w:before="0" w:line="360"/>
+              <w:ind w:firstLine="420"/>
+              <w:jc w:val="left"/>
+            </w:pPr>
+            <w:r>
+              <w:rPr>
+                <w:rFonts w:ascii="宋体" w:cs="宋体" w:eastAsia="宋体" w:hAnsi="宋体"/>
+                <w:sz w:val="21"/>
+                <w:szCs w:val="21"/>
+              </w:rPr>
+              <w:t xml:space="preserve">（3）超声回波信号模型。超声回波信号可表示为时域响应函数 s(t) = A(t)·sin(2πf₀t + φ)，其中A(t)表示衰减包络，f₀为中心频率，φ为初始相位。衰减包络通常服从指数衰减规律 A(t) = A₀·exp(-αt)，α为衰减系数。当探头与被测表面接触时，接触刚度k的变化导致反射系数R改变：R = (Z₂ - Z₁)/(Z₂ + Z₁)，其中Z₁、Z₂分别为两种介质的声阻抗。接触状态变化本质上改变边界条件，从而影响反射波幅值与相位。当探头完全接触时，反射系数最小，透射能量最大；当探头脱离时，反射系数趋近于1。</w:t>
+            </w:r>
+          </w:p>
+          <w:p>
+            <w:pPr>
+              <w:spacing w:after="0" w:before="0" w:line="360"/>
+              <w:ind w:firstLine="420"/>
+              <w:jc w:val="left"/>
+            </w:pPr>
+            <w:r>
+              <w:rPr>
+                <w:rFonts w:ascii="宋体" w:cs="宋体" w:eastAsia="宋体" w:hAnsi="宋体"/>
+                <w:sz w:val="21"/>
+                <w:szCs w:val="21"/>
+              </w:rPr>
+              <w:t xml:space="preserve">（4）接触状态检测模型。接触检测可建模为信号统计特征分布变化问题。设接触状态为s ∈ {接触, 非接触}，观测信号为x(t)，则接触概率可表示为P(s=接触|x) = σ(wᵀ·Φ(x) + b)，其中Φ(x)为信号特征提取函数，包括信号幅值、频率、相位等统计特征，σ为sigmoid激活函数。该模型将接触判定从阈值判断提升为概率估计，为后续多模态融合奠定基础。在实际应用中，单一超声信号受噪声干扰较大，需结合其他传感器信息提高判定可靠性。</w:t>
+            </w:r>
+          </w:p>
+          <w:p>
+            <w:pPr>
+              <w:spacing w:after="0" w:before="0" w:line="360"/>
+              <w:jc w:val="left"/>
+            </w:pPr>
+            <w:r>
+              <w:rPr>
+                <w:rFonts w:ascii="宋体" w:cs="宋体" w:eastAsia="宋体" w:hAnsi="宋体"/>
+                <w:sz w:val="21"/>
+                <w:szCs w:val="21"/>
+              </w:rPr>
+              <w:t xml:space="preserve"/>
+            </w:r>
+          </w:p>
+          <w:p>
+            <w:pPr>
+              <w:spacing w:after="0" w:before="60" w:line="360"/>
+              <w:jc w:val="left"/>
+            </w:pPr>
+            <w:r>
+              <w:rPr>
+                <w:rFonts w:ascii="宋体" w:cs="宋体" w:eastAsia="宋体" w:hAnsi="宋体"/>
+                <w:b/>
+                <w:bCs/>
+                <w:sz w:val="21"/>
+                <w:szCs w:val="21"/>
+              </w:rPr>
+              <w:t xml:space="preserve">3.2 多模态时序建模框架设计</w:t>
+            </w:r>
+          </w:p>
+          <w:p>
+            <w:pPr>
+              <w:spacing w:after="0" w:before="0" w:line="360"/>
+              <w:jc w:val="left"/>
+            </w:pPr>
+            <w:r>
+              <w:rPr>
+                <w:rFonts w:ascii="宋体" w:cs="宋体" w:eastAsia="宋体" w:hAnsi="宋体"/>
+                <w:sz w:val="21"/>
+                <w:szCs w:val="21"/>
+              </w:rPr>
+              <w:t xml:space="preserve"/>
+            </w:r>
+          </w:p>
+          <w:p>
+            <w:pPr>
+              <w:spacing w:after="0" w:before="0" w:line="360"/>
+              <w:ind w:firstLine="420"/>
+              <w:jc w:val="left"/>
+            </w:pPr>
+            <w:r>
+              <w:rPr>
+                <w:rFonts w:ascii="宋体" w:cs="宋体" w:eastAsia="宋体" w:hAnsi="宋体"/>
+                <w:sz w:val="21"/>
+                <w:szCs w:val="21"/>
+              </w:rPr>
+              <w:t xml:space="preserve">系统输入为三类时间序列：超声回波特征x_u(t) ∈ ℝ^{d_u}、位姿误差特征x_p(t) ∈ ℝ^{d_p}、视觉ROI特征x_v(t) ∈ ℝ^{d_v}。三者采样频率不同（EMAT约40 Hz，位姿约100 Hz，视觉约30 Hz），需通过时序对齐统一至相同时间尺度。多模态融合的核心挑战在于：如何在保持各模态特性的同时，实现跨模态信息的有效交互与互补。</w:t>
+            </w:r>
+          </w:p>
+          <w:p>
+            <w:pPr>
+              <w:spacing w:after="0" w:before="0" w:line="360"/>
+              <w:ind w:firstLine="420"/>
+              <w:jc w:val="left"/>
+            </w:pPr>
+            <w:r>
+              <w:rPr>
+                <w:rFonts w:ascii="宋体" w:cs="宋体" w:eastAsia="宋体" w:hAnsi="宋体"/>
+                <w:sz w:val="21"/>
+                <w:szCs w:val="21"/>
+              </w:rPr>
+              <w:t xml:space="preserve">（1）模态编码。各模态先通过独立编码器映射至统一特征空间：f_u(t) = E_u(x_u(t))，其中E_u为一维卷积网络加位置编码，用于提取超声信号的时频特征；f_p(t) = E_p(x_p(t))，其中E_p为多层感知机，用于编码位姿误差的动态变化；f_v(t) = E_v(x_v(t))，其中E_v为CNN或Vision Transformer，用于提取视觉ROI的几何与纹理特征。编码后的特征维度统一为d_model，便于后续跨模态交互。位置编码采用正弦余弦函数：PE(pos,2i) = sin(pos/10000^{2i/d_model})，PE(pos,2i+1) = cos(pos/10000^{2i/d_model})，以保留时序信息。</w:t>
+            </w:r>
+          </w:p>
+          <w:p>
+            <w:pPr>
+              <w:spacing w:after="0" w:before="0" w:line="360"/>
+              <w:ind w:firstLine="420"/>
+              <w:jc w:val="left"/>
+            </w:pPr>
+            <w:r>
+              <w:rPr>
+                <w:rFonts w:ascii="宋体" w:cs="宋体" w:eastAsia="宋体" w:hAnsi="宋体"/>
+                <w:sz w:val="21"/>
+                <w:szCs w:val="21"/>
+              </w:rPr>
+              <w:t xml:space="preserve">（2）跨模态对齐机制。采用跨模态注意力实现不同物理信号之间的特征对齐。以超声-位姿交互为例：A_{up} = softmax(Q_u · K_pᵀ / √d) · V_p，其中Q_u = f_u · W_Q，K_p = f_p · W_K，V_p = f_p · W_V。类似地计算超声-视觉交互A_{uv}。最终融合表示为 f_fused = [A_{up}; A_{uv}]，通过拼接实现多模态信息整合。该机制使模型能够自动学习不同模态之间的互补关系，例如当超声信号受干扰时，增加视觉和位姿模态的权重。</w:t>
+            </w:r>
+          </w:p>
+          <w:p>
+            <w:pPr>
+              <w:spacing w:after="0" w:before="0" w:line="360"/>
+              <w:ind w:firstLine="420"/>
+              <w:jc w:val="left"/>
+            </w:pPr>
+            <w:r>
+              <w:rPr>
+                <w:rFonts w:ascii="宋体" w:cs="宋体" w:eastAsia="宋体" w:hAnsi="宋体"/>
+                <w:sz w:val="21"/>
+                <w:szCs w:val="21"/>
+              </w:rPr>
+              <w:t xml:space="preserve">（3）时序建模。对融合序列进行时序建模：h_t = Transformer(f_fused(t-T:t))，其中T为时间窗口长度。Transformer通过多头注意力机制捕捉全局时间依赖关系，MultiHead(Q,K,V) = Concat(head_1,...,head_h)·W^O，其中head_i = Attention(Q·W_i^Q, K·W_i^K, V·W_i^V)。输出当前状态向量h_t ∈ ℝ^{d_model}，用于后续接触状态判定。时序建模能够捕捉接触状态的动态演化规律，为状态转移约束提供基础。</w:t>
+            </w:r>
+          </w:p>
+          <w:p>
+            <w:pPr>
+              <w:spacing w:after="0" w:before="0" w:line="360"/>
+              <w:jc w:val="left"/>
+            </w:pPr>
+            <w:r>
+              <w:rPr>
+                <w:rFonts w:ascii="宋体" w:cs="宋体" w:eastAsia="宋体" w:hAnsi="宋体"/>
+                <w:sz w:val="21"/>
+                <w:szCs w:val="21"/>
+              </w:rPr>
+              <w:t xml:space="preserve"/>
+            </w:r>
+          </w:p>
+          <w:p>
+            <w:pPr>
+              <w:spacing w:after="0" w:before="60" w:line="360"/>
+              <w:jc w:val="left"/>
+            </w:pPr>
+            <w:r>
+              <w:rPr>
+                <w:rFonts w:ascii="宋体" w:cs="宋体" w:eastAsia="宋体" w:hAnsi="宋体"/>
+                <w:b/>
+                <w:bCs/>
+                <w:sz w:val="21"/>
+                <w:szCs w:val="21"/>
+              </w:rPr>
+              <w:t xml:space="preserve">3.3 物理约束注意力机制</w:t>
+            </w:r>
+          </w:p>
+          <w:p>
+            <w:pPr>
+              <w:spacing w:after="0" w:before="0" w:line="360"/>
+              <w:jc w:val="left"/>
+            </w:pPr>
+            <w:r>
+              <w:rPr>
+                <w:rFonts w:ascii="宋体" w:cs="宋体" w:eastAsia="宋体" w:hAnsi="宋体"/>
+                <w:sz w:val="21"/>
+                <w:szCs w:val="21"/>
+              </w:rPr>
+              <w:t xml:space="preserve"/>
+            </w:r>
+          </w:p>
+          <w:p>
+            <w:pPr>
+              <w:spacing w:after="0" w:before="0" w:line="360"/>
+              <w:ind w:firstLine="420"/>
+              <w:jc w:val="left"/>
+            </w:pPr>
+            <w:r>
+              <w:rPr>
+                <w:rFonts w:ascii="宋体" w:cs="宋体" w:eastAsia="宋体" w:hAnsi="宋体"/>
+                <w:sz w:val="21"/>
+                <w:szCs w:val="21"/>
+              </w:rPr>
+              <w:t xml:space="preserve">传统Transformer的自注意力权重仅由特征相似度决定，缺乏物理可解释性。为增强物理一致性，本研究在自注意力计算中引入物理约束矩阵P，将无人机动力学模型与接触物理先验嵌入特征交互过程。该方法的核心思想是：让模型不仅从数据中学习模式，还要遵循物理规律。</w:t>
+            </w:r>
+          </w:p>
+          <w:p>
+            <w:pPr>
+              <w:spacing w:after="0" w:before="0" w:line="360"/>
+              <w:ind w:firstLine="420"/>
+              <w:jc w:val="left"/>
+            </w:pPr>
+            <w:r>
+              <w:rPr>
+                <w:rFonts w:ascii="宋体" w:cs="宋体" w:eastAsia="宋体" w:hAnsi="宋体"/>
+                <w:sz w:val="21"/>
+                <w:szCs w:val="21"/>
+              </w:rPr>
+              <w:t xml:space="preserve">（1）物理约束矩阵构造。基于无人机动力学模型构造约束项。平移运动模型：m·a = F_thrust - mg - F_drag，其中m为质量，a为加速度，F_thrust为推力，F_drag为空气阻力（与速度平方成正比）。姿态变化模型：I·α = τ - τ_disturbance，其中I为转动惯量，α为角加速度，τ为控制力矩，τ_disturbance为扰动力矩。这两个方程描述了无人机在自由飞行状态下的动力学行为，当接触发生时，需要额外考虑接触力的影响。</w:t>
+            </w:r>
+          </w:p>
+          <w:p>
+            <w:pPr>
+              <w:spacing w:after="0" w:before="0" w:line="360"/>
+              <w:ind w:firstLine="420"/>
+              <w:jc w:val="left"/>
+            </w:pPr>
+            <w:r>
+              <w:rPr>
+                <w:rFonts w:ascii="宋体" w:cs="宋体" w:eastAsia="宋体" w:hAnsi="宋体"/>
+                <w:sz w:val="21"/>
+                <w:szCs w:val="21"/>
+              </w:rPr>
+              <w:t xml:space="preserve">（2）接触物理先验。当探头与被测表面发生接触时，法向力F_n会突变，导致无人机速度变化||Δv_t|| ≈ 0（因接触约束），而加速度||a_t||显著变化。基于该物理先验，构造约束项：P_ij = exp(-||r_ij||_dyn²/σ²)，其中||·||_dyn表示动力学残差，σ为温度参数。物理约束矩阵P与原始注意力权重A逐元素相乘，得到物理约束注意力：A_physics = softmax((Q·Kᵀ/√d) ⊙ P) · V。该设计确保注意力权重不仅反映特征相似度，还满足动力学一致性。</w:t>
+            </w:r>
+          </w:p>
+          <w:p>
+            <w:pPr>
+              <w:spacing w:after="0" w:before="0" w:line="360"/>
+              <w:ind w:firstLine="420"/>
+              <w:jc w:val="left"/>
+            </w:pPr>
+            <w:r>
+              <w:rPr>
+                <w:rFonts w:ascii="宋体" w:cs="宋体" w:eastAsia="宋体" w:hAnsi="宋体"/>
+                <w:sz w:val="21"/>
+                <w:szCs w:val="21"/>
+              </w:rPr>
+              <w:t xml:space="preserve">（3）损失函数设计。定义接触预测概率 ŷ = σ(W_o · h_t + b_o)，其中σ为sigmoid函数。物理残差定义为 L_physics = ||m·â - F̂_thrust + mg||²，其中â为网络预测的加速度，F̂_thrust为预测推力。总损失函数为 L = L_CE + λ·L_physics，其中L_CE为接触概率交叉熵损失，λ为物理约束权重系数，可通过交叉验证或自适应调节确定。该设计强制网络输出满足动力学合理性，避免纯数据驱动模型产生违背物理规律的预测。</w:t>
+            </w:r>
+          </w:p>
+          <w:p>
+            <w:pPr>
+              <w:spacing w:after="0" w:before="0" w:line="360"/>
+              <w:jc w:val="left"/>
+            </w:pPr>
+            <w:r>
+              <w:rPr>
+                <w:rFonts w:ascii="宋体" w:cs="宋体" w:eastAsia="宋体" w:hAnsi="宋体"/>
+                <w:sz w:val="21"/>
+                <w:szCs w:val="21"/>
+              </w:rPr>
+              <w:t xml:space="preserve"/>
+            </w:r>
+          </w:p>
+          <w:p>
+            <w:pPr>
+              <w:spacing w:after="0" w:before="60" w:line="360"/>
+              <w:jc w:val="left"/>
+            </w:pPr>
+            <w:r>
+              <w:rPr>
+                <w:rFonts w:ascii="宋体" w:cs="宋体" w:eastAsia="宋体" w:hAnsi="宋体"/>
+                <w:b/>
+                <w:bCs/>
+                <w:sz w:val="21"/>
+                <w:szCs w:val="21"/>
+              </w:rPr>
+              <w:t xml:space="preserve">3.4 状态转移约束模型</w:t>
+            </w:r>
+          </w:p>
+          <w:p>
+            <w:pPr>
+              <w:spacing w:after="0" w:before="0" w:line="360"/>
+              <w:jc w:val="left"/>
+            </w:pPr>
+            <w:r>
+              <w:rPr>
+                <w:rFonts w:ascii="宋体" w:cs="宋体" w:eastAsia="宋体" w:hAnsi="宋体"/>
+                <w:sz w:val="21"/>
+                <w:szCs w:val="21"/>
+              </w:rPr>
+              <w:t xml:space="preserve"/>
+            </w:r>
+          </w:p>
+          <w:p>
+            <w:pPr>
+              <w:spacing w:after="0" w:before="0" w:line="360"/>
+              <w:ind w:firstLine="420"/>
+              <w:jc w:val="left"/>
+            </w:pPr>
+            <w:r>
+              <w:rPr>
+                <w:rFonts w:ascii="宋体" w:cs="宋体" w:eastAsia="宋体" w:hAnsi="宋体"/>
+                <w:sz w:val="21"/>
+                <w:szCs w:val="21"/>
+              </w:rPr>
+              <w:t xml:space="preserve">接触状态具有时序连续性特征。传统逐帧分类模型容易出现频繁状态跳变，影响控制决策稳定性。例如，在探头接近被测表面时，可能因微小振动导致分类结果在接触与非接触之间快速切换，这种抖动会传递给控制系统，造成飞行不稳定。本研究引入状态转移约束模型，将接触判定视为隐状态演化过程，通过概率平滑约束抑制瞬时误判。</w:t>
+            </w:r>
+          </w:p>
+          <w:p>
+            <w:pPr>
+              <w:spacing w:after="0" w:before="0" w:line="360"/>
+              <w:ind w:firstLine="420"/>
+              <w:jc w:val="left"/>
+            </w:pPr>
+            <w:r>
+              <w:rPr>
+                <w:rFonts w:ascii="宋体" w:cs="宋体" w:eastAsia="宋体" w:hAnsi="宋体"/>
+                <w:sz w:val="21"/>
+                <w:szCs w:val="21"/>
+              </w:rPr>
+              <w:t xml:space="preserve">（1）隐马尔可夫模型（HMM）。设接触状态s_t ∈ {0, 1}为隐变量，观测向量o_t = h_t为Transformer输出的状态向量。状态转移概率为 P(s_t|s_{t-1})，构成2×2转移矩阵A，其中A_ij = P(s_t=j|s_{t-1}=i)。观测概率为 P(o_t|s_t)，通常建模为高斯分布或神经网络输出。联合概率为 P(s_{1:T}, o_{1:T}) = Π_t P(s_t|s_{t-1})·P(o_t|s_t)。通过Viterbi算法求解最优状态序列：s* = argmax P(s_{1:T}|o_{1:T})。HMM的优势在于能够利用历史信息平滑当前判定，减少瞬时噪声的影响。</w:t>
+            </w:r>
+          </w:p>
+          <w:p>
+            <w:pPr>
+              <w:spacing w:after="0" w:before="0" w:line="360"/>
+              <w:ind w:firstLine="420"/>
+              <w:jc w:val="left"/>
+            </w:pPr>
+            <w:r>
+              <w:rPr>
+                <w:rFonts w:ascii="宋体" w:cs="宋体" w:eastAsia="宋体" w:hAnsi="宋体"/>
+                <w:sz w:val="21"/>
+                <w:szCs w:val="21"/>
+              </w:rPr>
+              <w:t xml:space="preserve">（2）平滑约束。为避免频繁跳变，引入平滑约束项：L_smooth = Σ_t ||s_t - s_{t-1}||²，惩罚相邻时刻的状态变化。该约束与观测概率联合优化，保证状态演化符合实际接触物理过程。在实际应用中，可通过调节平滑权重λ_smooth控制状态变化的灵敏度：λ_smooth越大，状态越稳定，但响应速度越慢；反之亦然。需要根据具体应用场景在稳定性和响应速度之间取得平衡。</w:t>
+            </w:r>
+          </w:p>
+          <w:p>
+            <w:pPr>
+              <w:spacing w:after="0" w:before="0" w:line="360"/>
+              <w:ind w:firstLine="420"/>
+              <w:jc w:val="left"/>
+            </w:pPr>
+            <w:r>
+              <w:rPr>
+                <w:rFonts w:ascii="宋体" w:cs="宋体" w:eastAsia="宋体" w:hAnsi="宋体"/>
+                <w:sz w:val="21"/>
+                <w:szCs w:val="21"/>
+              </w:rPr>
+              <w:t xml:space="preserve">（3）条件随机场（CRF）扩展。考虑采用CRF结构进行约束推断，定义全局归一化的状态序列概率：P(s_{1:T}|o_{1:T}) = exp(Σ_t [ψ(s_t, o_t) + φ(s_t, s_{t-1})]) / Z(o_{1:T})，其中ψ(s_t, o_t)为发射得分函数，衡量状态s_t与观测o_t的匹配程度；φ(s_t, s_{t-1})为转移得分函数，衡量相邻状态的转移合理性；Z(o_{1:T})为配分函数，确保概率归一化。CRF能够建模全局依赖关系，避免HMM的独立性假设限制，进一步提升状态判定的连续性与稳定性。与HMM相比，CRF不需要假设观测独立，能够更灵活地建模复杂依赖关系。</w:t>
+            </w:r>
+          </w:p>
+          <w:p>
+            <w:pPr>
+              <w:spacing w:after="0" w:before="0" w:line="360"/>
+              <w:jc w:val="left"/>
+            </w:pPr>
+            <w:r>
+              <w:rPr>
+                <w:rFonts w:ascii="宋体" w:cs="宋体" w:eastAsia="宋体" w:hAnsi="宋体"/>
+                <w:sz w:val="21"/>
+                <w:szCs w:val="21"/>
+              </w:rPr>
+              <w:t xml:space="preserve"/>
+            </w:r>
+          </w:p>
+          <w:p>
+            <w:pPr>
+              <w:spacing w:after="0" w:before="60" w:line="360"/>
+              <w:jc w:val="left"/>
+            </w:pPr>
+            <w:r>
+              <w:rPr>
+                <w:rFonts w:ascii="宋体" w:cs="宋体" w:eastAsia="宋体" w:hAnsi="宋体"/>
+                <w:b/>
+                <w:bCs/>
+                <w:sz w:val="21"/>
+                <w:szCs w:val="21"/>
+              </w:rPr>
+              <w:t xml:space="preserve">3.5 理论框架总结</w:t>
+            </w:r>
+          </w:p>
+          <w:p>
+            <w:pPr>
+              <w:spacing w:after="0" w:before="0" w:line="360"/>
+              <w:jc w:val="left"/>
+            </w:pPr>
+            <w:r>
+              <w:rPr>
+                <w:rFonts w:ascii="宋体" w:cs="宋体" w:eastAsia="宋体" w:hAnsi="宋体"/>
+                <w:sz w:val="21"/>
+                <w:szCs w:val="21"/>
+              </w:rPr>
+              <w:t xml:space="preserve"/>
+            </w:r>
+          </w:p>
+          <w:p>
+            <w:pPr>
+              <w:spacing w:after="0" w:before="0" w:line="360"/>
+              <w:ind w:firstLine="420"/>
+              <w:jc w:val="left"/>
+            </w:pPr>
+            <w:r>
+              <w:rPr>
+                <w:rFonts w:ascii="宋体" w:cs="宋体" w:eastAsia="宋体" w:hAnsi="宋体"/>
+                <w:sz w:val="21"/>
+                <w:szCs w:val="21"/>
+              </w:rPr>
+              <w:t xml:space="preserve">上述理论框架形成从信号采集到状态判定的完整链路：EMAT理论提供超声回波的物理基础，多模态时序建模框架实现异构传感器数据的统一表征，物理约束注意力机制将动力学先验嵌入特征交互过程，状态转移约束模型保证判定结果的时序连续性。四层理论逐级施加约束，从底层信号物理到顶层决策逻辑形成闭环，为无人机自主电磁超声探测提供系统化的理论支撑。该理论框架的核心创新在于：将物理先验与数据驱动方法有机结合，既保留了深度学习的特征提取能力，又确保了输出的物理合理性。</w:t>
+            </w:r>
+          </w:p>
+          <w:p>
+            <w:pPr>
+              <w:spacing w:after="0" w:before="120" w:line="360"/>
+              <w:jc w:val="left"/>
+            </w:pPr>
+            <w:r>
+              <w:rPr>
+                <w:rFonts w:ascii="宋体" w:cs="宋体" w:eastAsia="宋体" w:hAnsi="宋体"/>
+                <w:b/>
+                <w:bCs/>
+                <w:sz w:val="21"/>
+                <w:szCs w:val="21"/>
+              </w:rPr>
+              <w:t xml:space="preserve">4、下一步工作计划</w:t>
+            </w:r>
+          </w:p>
+          <w:p>
+            <w:pPr>
+              <w:spacing w:after="0" w:before="0" w:line="360"/>
+              <w:ind w:firstLine="420"/>
+              <w:jc w:val="left"/>
+            </w:pPr>
+            <w:r>
+              <w:rPr>
+                <w:rFonts w:ascii="宋体" w:cs="宋体" w:eastAsia="宋体" w:hAnsi="宋体"/>
+                <w:sz w:val="21"/>
+                <w:szCs w:val="21"/>
+              </w:rPr>
+              <w:t xml:space="preserve">（1）完成多模态融合算法的代码实现与离线验证；</w:t>
+            </w:r>
+          </w:p>
+          <w:p>
+            <w:pPr>
+              <w:spacing w:after="0" w:before="0" w:line="360"/>
+              <w:ind w:firstLine="420"/>
+              <w:jc w:val="left"/>
+            </w:pPr>
+            <w:r>
+              <w:rPr>
+                <w:rFonts w:ascii="宋体" w:cs="宋体" w:eastAsia="宋体" w:hAnsi="宋体"/>
+                <w:sz w:val="21"/>
+                <w:szCs w:val="21"/>
+              </w:rPr>
+              <w:t xml:space="preserve">（2）开展多场景对比实验与消融分析，评估模型鲁棒性、实时性及泛化能力；</w:t>
+            </w:r>
+          </w:p>
+          <w:p>
+            <w:pPr>
+              <w:spacing w:after="0" w:before="0" w:line="360"/>
+              <w:ind w:firstLine="420"/>
+              <w:jc w:val="left"/>
+            </w:pPr>
+            <w:r>
+              <w:rPr>
+                <w:rFonts w:ascii="宋体" w:cs="宋体" w:eastAsia="宋体" w:hAnsi="宋体"/>
+                <w:sz w:val="21"/>
+                <w:szCs w:val="21"/>
+              </w:rPr>
+              <w:t xml:space="preserve">（3）探索嵌入式平台（Jetson）上的模型轻量化部署方案；</w:t>
+            </w:r>
+          </w:p>
+          <w:p>
+            <w:pPr>
+              <w:spacing w:after="0" w:before="0" w:line="360"/>
+              <w:ind w:firstLine="420"/>
+              <w:jc w:val="left"/>
+            </w:pPr>
+            <w:r>
+              <w:rPr>
+                <w:rFonts w:ascii="宋体" w:cs="宋体" w:eastAsia="宋体" w:hAnsi="宋体"/>
+                <w:sz w:val="21"/>
+                <w:szCs w:val="21"/>
+              </w:rPr>
+              <w:t xml:space="preserve">（4）撰写学位论文。</w:t>
+            </w:r>
+          </w:p>
+        </w:tc>
+      </w:tr>
+      <w:tr>
+        <w:tc>
+          <w:tcPr>
+            <w:tcBorders>
+              <w:top w:val="single" w:color="000000" w:sz="1"/>
+              <w:left w:val="single" w:color="000000" w:sz="1"/>
+              <w:bottom w:val="single" w:color="000000" w:sz="1"/>
+              <w:right w:val="single" w:color="000000" w:sz="1"/>
+            </w:tcBorders>
+            <w:tcMar>
+              <w:top w:type="dxa" w:w="60"/>
+              <w:left w:type="dxa" w:w="80"/>
+              <w:bottom w:type="dxa" w:w="60"/>
+              <w:right w:type="dxa" w:w="80"/>
+            </w:tcMar>
+            <w:vAlign w:val="center"/>
+          </w:tcPr>
+          <w:p>
+            <w:pPr>
+              <w:spacing w:after="0" w:before="0" w:line="360"/>
+              <w:jc w:val="left"/>
+            </w:pPr>
+            <w:r>
+              <w:rPr>
+                <w:rFonts w:ascii="宋体" w:cs="宋体" w:eastAsia="宋体" w:hAnsi="宋体"/>
+                <w:b/>
+                <w:bCs/>
+                <w:sz w:val="21"/>
+                <w:szCs w:val="21"/>
+              </w:rPr>
+              <w:t xml:space="preserve">4. 阶段性研究成果</w:t>
+            </w:r>
+          </w:p>
+        </w:tc>
+      </w:tr>
+      <w:tr>
+        <w:tc>
+          <w:tcPr>
+            <w:tcBorders>
+              <w:top w:val="single" w:color="000000" w:sz="1"/>
+              <w:left w:val="single" w:color="000000" w:sz="1"/>
+              <w:bottom w:val="single" w:color="000000" w:sz="1"/>
+              <w:right w:val="single" w:color="000000" w:sz="1"/>
+            </w:tcBorders>
+            <w:tcMar>
+              <w:top w:type="dxa" w:w="60"/>
+              <w:left w:type="dxa" w:w="80"/>
+              <w:bottom w:type="dxa" w:w="60"/>
+              <w:right w:type="dxa" w:w="80"/>
+            </w:tcMar>
+            <w:vAlign w:val="center"/>
+          </w:tcPr>
+          <w:p>
+            <w:pPr>
+              <w:spacing w:after="0" w:before="0" w:line="360"/>
+              <w:jc w:val="left"/>
+            </w:pPr>
+            <w:r>
+              <w:rPr>
+                <w:rFonts w:ascii="宋体" w:cs="宋体" w:eastAsia="宋体" w:hAnsi="宋体"/>
+                <w:sz w:val="18"/>
+                <w:szCs w:val="18"/>
+              </w:rPr>
+              <w:t xml:space="preserve">按《研究生学位论文撰写格式规范》的格式要求分类填写与学位论文相关的阶段性研究成果</w:t>
+            </w:r>
+          </w:p>
+          <w:p>
+            <w:pPr>
+              <w:spacing w:after="0" w:before="0" w:line="360"/>
+              <w:jc w:val="left"/>
+            </w:pPr>
+            <w:r>
+              <w:rPr>
+                <w:rFonts w:ascii="宋体" w:cs="宋体" w:eastAsia="宋体" w:hAnsi="宋体"/>
+                <w:sz w:val="21"/>
+                <w:szCs w:val="21"/>
+              </w:rPr>
+              <w:t xml:space="preserve"/>
+            </w:r>
+          </w:p>
+          <w:p>
+            <w:pPr>
+              <w:spacing w:after="0" w:before="60" w:line="360"/>
+              <w:jc w:val="left"/>
+            </w:pPr>
+            <w:r>
+              <w:rPr>
+                <w:rFonts w:ascii="宋体" w:cs="宋体" w:eastAsia="宋体" w:hAnsi="宋体"/>
+                <w:b/>
+                <w:bCs/>
+                <w:sz w:val="21"/>
+                <w:szCs w:val="21"/>
+              </w:rPr>
+              <w:t xml:space="preserve">1. 硬件系统</w:t>
+            </w:r>
+          </w:p>
+          <w:p>
+            <w:pPr>
+              <w:spacing w:after="0" w:before="0" w:line="360"/>
+              <w:ind w:firstLine="420"/>
+              <w:jc w:val="left"/>
+            </w:pPr>
+            <w:r>
+              <w:rPr>
+                <w:rFonts w:ascii="宋体" w:cs="宋体" w:eastAsia="宋体" w:hAnsi="宋体"/>
+                <w:sz w:val="21"/>
+                <w:szCs w:val="21"/>
+              </w:rPr>
+              <w:t xml:space="preserve">（1）完成EMAT探头制作、调试与ROS驱动开发，实现40 Hz稳定波形采集；</w:t>
+            </w:r>
+          </w:p>
+          <w:p>
+            <w:pPr>
+              <w:spacing w:after="0" w:before="0" w:line="360"/>
+              <w:ind w:firstLine="420"/>
+              <w:jc w:val="left"/>
+            </w:pPr>
+            <w:r>
+              <w:rPr>
+                <w:rFonts w:ascii="宋体" w:cs="宋体" w:eastAsia="宋体" w:hAnsi="宋体"/>
+                <w:sz w:val="21"/>
+                <w:szCs w:val="21"/>
+              </w:rPr>
+              <w:t xml:space="preserve">（2）完成无人机实验平台搭建，集成LiDAR、RGBD相机与PX4飞控，实现自主飞行与多模态数据同步采集。</w:t>
+            </w:r>
+          </w:p>
+          <w:p>
+            <w:pPr>
+              <w:spacing w:after="0" w:before="0" w:line="360"/>
+              <w:jc w:val="left"/>
+            </w:pPr>
+            <w:r>
+              <w:rPr>
+                <w:rFonts w:ascii="宋体" w:cs="宋体" w:eastAsia="宋体" w:hAnsi="宋体"/>
+                <w:sz w:val="21"/>
+                <w:szCs w:val="21"/>
+              </w:rPr>
+              <w:t xml:space="preserve"/>
+            </w:r>
+          </w:p>
+          <w:p>
+            <w:pPr>
+              <w:spacing w:after="0" w:before="60" w:line="360"/>
+              <w:jc w:val="left"/>
+            </w:pPr>
+            <w:r>
+              <w:rPr>
+                <w:rFonts w:ascii="宋体" w:cs="宋体" w:eastAsia="宋体" w:hAnsi="宋体"/>
+                <w:b/>
+                <w:bCs/>
+                <w:sz w:val="21"/>
+                <w:szCs w:val="21"/>
+              </w:rPr>
+              <w:t xml:space="preserve">2. 软件系统</w:t>
+            </w:r>
+          </w:p>
+          <w:p>
+            <w:pPr>
+              <w:spacing w:after="0" w:before="0" w:line="360"/>
+              <w:ind w:firstLine="420"/>
+              <w:jc w:val="left"/>
+            </w:pPr>
+            <w:r>
+              <w:rPr>
+                <w:rFonts w:ascii="宋体" w:cs="宋体" w:eastAsia="宋体" w:hAnsi="宋体"/>
+                <w:sz w:val="21"/>
+                <w:szCs w:val="21"/>
+              </w:rPr>
+              <w:t xml:space="preserve">（1）开发EMAT ROS驱动节点（C++17），支持二进制协议通信、自动重连与Qt5波形可视化；</w:t>
+            </w:r>
+          </w:p>
+          <w:p>
+            <w:pPr>
+              <w:spacing w:after="0" w:before="0" w:line="360"/>
+              <w:ind w:firstLine="420"/>
+              <w:jc w:val="left"/>
+            </w:pPr>
+            <w:r>
+              <w:rPr>
+                <w:rFonts w:ascii="宋体" w:cs="宋体" w:eastAsia="宋体" w:hAnsi="宋体"/>
+                <w:sz w:val="21"/>
+                <w:szCs w:val="21"/>
+              </w:rPr>
+              <w:t xml:space="preserve">（2）开发视觉引导自主规划程序，实现目标选取、路径规划与精确接近的完整流程；</w:t>
+            </w:r>
+          </w:p>
+          <w:p>
+            <w:pPr>
+              <w:spacing w:after="0" w:before="0" w:line="360"/>
+              <w:ind w:firstLine="420"/>
+              <w:jc w:val="left"/>
+            </w:pPr>
+            <w:r>
+              <w:rPr>
+                <w:rFonts w:ascii="宋体" w:cs="宋体" w:eastAsia="宋体" w:hAnsi="宋体"/>
+                <w:sz w:val="21"/>
+                <w:szCs w:val="21"/>
+              </w:rPr>
+              <w:t xml:space="preserve">（3）开发record数据记录节点，同步记录位姿、RGBD视频与EMAT波形数据。</w:t>
+            </w:r>
+          </w:p>
+          <w:p>
+            <w:pPr>
+              <w:spacing w:after="0" w:before="0" w:line="360"/>
+              <w:jc w:val="left"/>
+            </w:pPr>
+            <w:r>
+              <w:rPr>
+                <w:rFonts w:ascii="宋体" w:cs="宋体" w:eastAsia="宋体" w:hAnsi="宋体"/>
+                <w:sz w:val="21"/>
+                <w:szCs w:val="21"/>
+              </w:rPr>
+              <w:t xml:space="preserve"/>
+            </w:r>
+          </w:p>
+          <w:p>
+            <w:pPr>
+              <w:spacing w:after="0" w:before="60" w:line="360"/>
+              <w:jc w:val="left"/>
+            </w:pPr>
+            <w:r>
+              <w:rPr>
+                <w:rFonts w:ascii="宋体" w:cs="宋体" w:eastAsia="宋体" w:hAnsi="宋体"/>
+                <w:b/>
+                <w:bCs/>
+                <w:sz w:val="21"/>
+                <w:szCs w:val="21"/>
+              </w:rPr>
+              <w:t xml:space="preserve">3. 实验验证</w:t>
+            </w:r>
+          </w:p>
+          <w:p>
+            <w:pPr>
+              <w:spacing w:after="0" w:before="0" w:line="360"/>
+              <w:ind w:firstLine="420"/>
+              <w:jc w:val="left"/>
+            </w:pPr>
+            <w:r>
+              <w:rPr>
+                <w:rFonts w:ascii="宋体" w:cs="宋体" w:eastAsia="宋体" w:hAnsi="宋体"/>
+                <w:sz w:val="21"/>
+                <w:szCs w:val="21"/>
+              </w:rPr>
+              <w:t xml:space="preserve">（1）实现无人机完全自动驾驶下的任意曲面稳定接触；</w:t>
+            </w:r>
+          </w:p>
+          <w:p>
+            <w:pPr>
+              <w:spacing w:after="0" w:before="0" w:line="360"/>
+              <w:ind w:firstLine="420"/>
+              <w:jc w:val="left"/>
+            </w:pPr>
+            <w:r>
+              <w:rPr>
+                <w:rFonts w:ascii="宋体" w:cs="宋体" w:eastAsia="宋体" w:hAnsi="宋体"/>
+                <w:sz w:val="21"/>
+                <w:szCs w:val="21"/>
+              </w:rPr>
+              <w:t xml:space="preserve">（2）验证位置-速度串级PID接触控制闭环的有效性。</w:t>
+            </w:r>
+          </w:p>
+        </w:tc>
+      </w:tr>
+      <w:tr>
+        <w:tc>
+          <w:tcPr>
+            <w:tcBorders>
+              <w:top w:val="single" w:color="000000" w:sz="1"/>
+              <w:left w:val="single" w:color="000000" w:sz="1"/>
+              <w:bottom w:val="single" w:color="000000" w:sz="1"/>
+              <w:right w:val="single" w:color="000000" w:sz="1"/>
+            </w:tcBorders>
+            <w:tcMar>
+              <w:top w:type="dxa" w:w="60"/>
+              <w:left w:type="dxa" w:w="80"/>
+              <w:bottom w:type="dxa" w:w="60"/>
+              <w:right w:type="dxa" w:w="80"/>
+            </w:tcMar>
+            <w:vAlign w:val="center"/>
+          </w:tcPr>
+          <w:p>
+            <w:pPr>
+              <w:spacing w:after="0" w:before="0" w:line="360"/>
+              <w:jc w:val="left"/>
+            </w:pPr>
+            <w:r>
+              <w:rPr>
+                <w:rFonts w:ascii="宋体" w:cs="宋体" w:eastAsia="宋体" w:hAnsi="宋体"/>
+                <w:b/>
+                <w:bCs/>
+                <w:sz w:val="21"/>
+                <w:szCs w:val="21"/>
+              </w:rPr>
+              <w:t xml:space="preserve">导师对工作进展及研究计划的意见：</w:t>
+            </w:r>
+          </w:p>
+        </w:tc>
+      </w:tr>
+      <w:tr>
+        <w:tc>
+          <w:tcPr>
+            <w:tcBorders>
+              <w:top w:val="single" w:color="000000" w:sz="1"/>
+              <w:left w:val="single" w:color="000000" w:sz="1"/>
+              <w:bottom w:val="single" w:color="000000" w:sz="1"/>
+              <w:right w:val="single" w:color="000000" w:sz="1"/>
+            </w:tcBorders>
+            <w:tcMar>
+              <w:top w:type="dxa" w:w="60"/>
+              <w:left w:type="dxa" w:w="80"/>
+              <w:bottom w:type="dxa" w:w="60"/>
+              <w:right w:type="dxa" w:w="80"/>
+            </w:tcMar>
+            <w:vAlign w:val="center"/>
+          </w:tcPr>
+          <w:p>
+            <w:pPr>
+              <w:spacing w:after="0" w:before="0" w:line="360"/>
+              <w:jc w:val="left"/>
+            </w:pPr>
+            <w:r>
+              <w:rPr>
+                <w:rFonts w:ascii="宋体" w:cs="宋体" w:eastAsia="宋体" w:hAnsi="宋体"/>
+                <w:sz w:val="21"/>
+                <w:szCs w:val="21"/>
+              </w:rPr>
+              <w:t xml:space="preserve">导师（组）签字：                                           年     月     日</w:t>
+            </w:r>
+          </w:p>
+        </w:tc>
+      </w:tr>
+      <w:tr>
+        <w:tc>
+          <w:tcPr>
+            <w:tcBorders>
+              <w:top w:val="single" w:color="000000" w:sz="1"/>
+              <w:left w:val="single" w:color="000000" w:sz="1"/>
+              <w:bottom w:val="single" w:color="000000" w:sz="1"/>
+              <w:right w:val="single" w:color="000000" w:sz="1"/>
+            </w:tcBorders>
+            <w:tcMar>
+              <w:top w:type="dxa" w:w="60"/>
+              <w:left w:type="dxa" w:w="80"/>
+              <w:bottom w:type="dxa" w:w="60"/>
+              <w:right w:type="dxa" w:w="80"/>
+            </w:tcMar>
+            <w:vAlign w:val="center"/>
+          </w:tcPr>
+          <w:p>
+            <w:pPr>
+              <w:spacing w:after="0" w:before="0" w:line="360"/>
+              <w:jc w:val="left"/>
+            </w:pPr>
+            <w:r>
+              <w:rPr>
+                <w:rFonts w:ascii="宋体" w:cs="宋体" w:eastAsia="宋体" w:hAnsi="宋体"/>
+                <w:b/>
+                <w:bCs/>
+                <w:sz w:val="21"/>
+                <w:szCs w:val="21"/>
+              </w:rPr>
+              <w:t xml:space="preserve">2.中期考评专家组意见</w:t>
+            </w:r>
+          </w:p>
+        </w:tc>
+      </w:tr>
+      <w:tr>
+        <w:tc>
+          <w:tcPr>
+            <w:tcBorders>
+              <w:top w:val="single" w:color="000000" w:sz="1"/>
+              <w:left w:val="single" w:color="000000" w:sz="1"/>
+              <w:bottom w:val="single" w:color="000000" w:sz="1"/>
+              <w:right w:val="single" w:color="000000" w:sz="1"/>
+            </w:tcBorders>
+            <w:tcMar>
+              <w:top w:type="dxa" w:w="60"/>
+              <w:left w:type="dxa" w:w="80"/>
+              <w:bottom w:type="dxa" w:w="60"/>
+              <w:right w:type="dxa" w:w="80"/>
+            </w:tcMar>
+            <w:vAlign w:val="center"/>
+          </w:tcPr>
+          <w:p>
+            <w:pPr>
+              <w:spacing w:after="0" w:before="0" w:line="360"/>
+              <w:jc w:val="left"/>
+            </w:pPr>
+            <w:r>
+              <w:rPr>
+                <w:rFonts w:ascii="宋体" w:cs="宋体" w:eastAsia="宋体" w:hAnsi="宋体"/>
+                <w:sz w:val="21"/>
+                <w:szCs w:val="21"/>
+              </w:rPr>
+              <w:t xml:space="preserve">考评日期</w:t>
+            </w:r>
+            <w:r>
+              <w:rPr>
+                <w:rFonts w:ascii="宋体" w:cs="宋体" w:eastAsia="宋体" w:hAnsi="宋体"/>
+                <w:sz w:val="21"/>
+                <w:szCs w:val="21"/>
+              </w:rPr>
+              <w:t xml:space="preserve">				</w:t>
+            </w:r>
+            <w:r>
+              <w:rPr>
+                <w:rFonts w:ascii="宋体" w:cs="宋体" w:eastAsia="宋体" w:hAnsi="宋体"/>
+                <w:sz w:val="21"/>
+                <w:szCs w:val="21"/>
+              </w:rPr>
+              <w:t xml:space="preserve">考评地点</w:t>
+            </w:r>
+          </w:p>
+        </w:tc>
+      </w:tr>
+      <w:tr>
+        <w:tc>
+          <w:tcPr>
+            <w:tcBorders>
+              <w:top w:val="single" w:color="000000" w:sz="1"/>
+              <w:left w:val="single" w:color="000000" w:sz="1"/>
+              <w:bottom w:val="single" w:color="000000" w:sz="1"/>
+              <w:right w:val="single" w:color="000000" w:sz="1"/>
+            </w:tcBorders>
+            <w:tcMar>
+              <w:top w:type="dxa" w:w="60"/>
+              <w:left w:type="dxa" w:w="80"/>
+              <w:bottom w:type="dxa" w:w="60"/>
+              <w:right w:type="dxa" w:w="80"/>
+            </w:tcMar>
+            <w:vAlign w:val="center"/>
+          </w:tcPr>
+          <w:p>
+            <w:pPr>
+              <w:spacing w:after="0" w:before="0" w:line="360"/>
+              <w:jc w:val="left"/>
+            </w:pPr>
+            <w:r>
+              <w:rPr>
+                <w:rFonts w:ascii="宋体" w:cs="宋体" w:eastAsia="宋体" w:hAnsi="宋体"/>
+                <w:sz w:val="21"/>
+                <w:szCs w:val="21"/>
+              </w:rPr>
+              <w:t xml:space="preserve">考评专家</w:t>
+            </w:r>
+          </w:p>
+        </w:tc>
+      </w:tr>
+      <w:tr>
+        <w:tc>
+          <w:tcPr>
+            <w:tcBorders>
+              <w:top w:val="single" w:color="000000" w:sz="1"/>
+              <w:left w:val="single" w:color="000000" w:sz="1"/>
+              <w:bottom w:val="single" w:color="000000" w:sz="1"/>
+              <w:right w:val="single" w:color="000000" w:sz="1"/>
+            </w:tcBorders>
+            <w:tcMar>
+              <w:top w:type="dxa" w:w="60"/>
+              <w:left w:type="dxa" w:w="80"/>
+              <w:bottom w:type="dxa" w:w="60"/>
+              <w:right w:type="dxa" w:w="80"/>
+            </w:tcMar>
+            <w:vAlign w:val="center"/>
+          </w:tcPr>
+          <w:p>
+            <w:pPr>
+              <w:spacing w:after="0" w:before="0" w:line="360"/>
+              <w:jc w:val="left"/>
+            </w:pPr>
+            <w:r>
+              <w:rPr>
+                <w:rFonts w:ascii="宋体" w:cs="宋体" w:eastAsia="宋体" w:hAnsi="宋体"/>
+                <w:sz w:val="21"/>
+                <w:szCs w:val="21"/>
+              </w:rPr>
+              <w:t xml:space="preserve">考评成绩</w:t>
+            </w:r>
+            <w:r>
+              <w:rPr>
+                <w:rFonts w:ascii="宋体" w:cs="宋体" w:eastAsia="宋体" w:hAnsi="宋体"/>
+                <w:sz w:val="21"/>
+                <w:szCs w:val="21"/>
+              </w:rPr>
+              <w:t xml:space="preserve">	</w:t>
+            </w:r>
+            <w:r>
+              <w:rPr>
+                <w:rFonts w:ascii="宋体" w:cs="宋体" w:eastAsia="宋体" w:hAnsi="宋体"/>
+                <w:sz w:val="21"/>
+                <w:szCs w:val="21"/>
+              </w:rPr>
+              <w:t xml:space="preserve">合格    票</w:t>
+            </w:r>
+            <w:r>
+              <w:rPr>
+                <w:rFonts w:ascii="宋体" w:cs="宋体" w:eastAsia="宋体" w:hAnsi="宋体"/>
+                <w:sz w:val="21"/>
+                <w:szCs w:val="21"/>
+              </w:rPr>
+              <w:t xml:space="preserve">	</w:t>
+            </w:r>
+            <w:r>
+              <w:rPr>
+                <w:rFonts w:ascii="宋体" w:cs="宋体" w:eastAsia="宋体" w:hAnsi="宋体"/>
+                <w:sz w:val="21"/>
+                <w:szCs w:val="21"/>
+              </w:rPr>
+              <w:t xml:space="preserve">基本合格    票</w:t>
+            </w:r>
+            <w:r>
+              <w:rPr>
+                <w:rFonts w:ascii="宋体" w:cs="宋体" w:eastAsia="宋体" w:hAnsi="宋体"/>
+                <w:sz w:val="21"/>
+                <w:szCs w:val="21"/>
+              </w:rPr>
+              <w:t xml:space="preserve">	</w:t>
+            </w:r>
+            <w:r>
+              <w:rPr>
+                <w:rFonts w:ascii="宋体" w:cs="宋体" w:eastAsia="宋体" w:hAnsi="宋体"/>
+                <w:sz w:val="21"/>
+                <w:szCs w:val="21"/>
+              </w:rPr>
+              <w:t xml:space="preserve">不合格    票</w:t>
+            </w:r>
+          </w:p>
+        </w:tc>
+      </w:tr>
+      <w:tr>
+        <w:tc>
+          <w:tcPr>
+            <w:tcBorders>
+              <w:top w:val="single" w:color="000000" w:sz="1"/>
+              <w:left w:val="single" w:color="000000" w:sz="1"/>
+              <w:bottom w:val="single" w:color="000000" w:sz="1"/>
+              <w:right w:val="single" w:color="000000" w:sz="1"/>
+            </w:tcBorders>
+            <w:tcMar>
+              <w:top w:type="dxa" w:w="60"/>
+              <w:left w:type="dxa" w:w="80"/>
+              <w:bottom w:type="dxa" w:w="60"/>
+              <w:right w:type="dxa" w:w="80"/>
+            </w:tcMar>
+            <w:vAlign w:val="center"/>
+          </w:tcPr>
+          <w:p>
+            <w:pPr>
+              <w:spacing w:after="0" w:before="0" w:line="360"/>
+              <w:jc w:val="left"/>
+            </w:pPr>
+            <w:r>
+              <w:rPr>
+                <w:rFonts w:ascii="宋体" w:cs="宋体" w:eastAsia="宋体" w:hAnsi="宋体"/>
+                <w:sz w:val="21"/>
+                <w:szCs w:val="21"/>
+              </w:rPr>
+              <w:t xml:space="preserve">□通过            □原则通过           □不通过</w:t>
+            </w:r>
+          </w:p>
+          <w:p>
+            <w:pPr>
+              <w:spacing w:after="0" w:before="0" w:line="360"/>
+              <w:jc w:val="left"/>
+            </w:pPr>
+            <w:r>
+              <w:rPr>
+                <w:rFonts w:ascii="宋体" w:cs="宋体" w:eastAsia="宋体" w:hAnsi="宋体"/>
+                <w:sz w:val="18"/>
+                <w:szCs w:val="18"/>
+              </w:rPr>
+              <w:t xml:space="preserve">通过：表决票均为合格</w:t>
+            </w:r>
+          </w:p>
+          <w:p>
+            <w:pPr>
+              <w:spacing w:after="0" w:before="0" w:line="360"/>
+              <w:jc w:val="left"/>
+            </w:pPr>
+            <w:r>
+              <w:rPr>
+                <w:rFonts w:ascii="宋体" w:cs="宋体" w:eastAsia="宋体" w:hAnsi="宋体"/>
+                <w:sz w:val="18"/>
+                <w:szCs w:val="18"/>
+              </w:rPr>
+              <w:t xml:space="preserve">原则通过：表决票中有1票为基本合格或不合格，其余为合格和基本合格</w:t>
+            </w:r>
+          </w:p>
+          <w:p>
+            <w:pPr>
+              <w:spacing w:after="0" w:before="0" w:line="360"/>
+              <w:jc w:val="left"/>
+            </w:pPr>
+            <w:r>
+              <w:rPr>
+                <w:rFonts w:ascii="宋体" w:cs="宋体" w:eastAsia="宋体" w:hAnsi="宋体"/>
+                <w:sz w:val="18"/>
+                <w:szCs w:val="18"/>
+              </w:rPr>
+              <w:t xml:space="preserve">不通过：表决票中有2票及以上为不合格</w:t>
+            </w:r>
+          </w:p>
+        </w:tc>
+      </w:tr>
+      <w:tr>
+        <w:tc>
+          <w:tcPr>
+            <w:tcBorders>
+              <w:top w:val="single" w:color="000000" w:sz="1"/>
+              <w:left w:val="single" w:color="000000" w:sz="1"/>
+              <w:bottom w:val="single" w:color="000000" w:sz="1"/>
+              <w:right w:val="single" w:color="000000" w:sz="1"/>
+            </w:tcBorders>
+            <w:tcMar>
+              <w:top w:type="dxa" w:w="60"/>
+              <w:left w:type="dxa" w:w="80"/>
+              <w:bottom w:type="dxa" w:w="60"/>
+              <w:right w:type="dxa" w:w="80"/>
+            </w:tcMar>
+            <w:vAlign w:val="center"/>
+          </w:tcPr>
+          <w:p>
+            <w:pPr>
+              <w:spacing w:after="0" w:before="0" w:line="360"/>
+              <w:jc w:val="left"/>
+            </w:pPr>
+            <w:r>
+              <w:rPr>
+                <w:rFonts w:ascii="宋体" w:cs="宋体" w:eastAsia="宋体" w:hAnsi="宋体"/>
+                <w:sz w:val="21"/>
+                <w:szCs w:val="21"/>
+              </w:rPr>
+              <w:t xml:space="preserve">对学位论文工作进展，从事科学研究的能力和作风，以及下一步研究计划的建议，是否适合继续攻读学位：</w:t>
+            </w:r>
+          </w:p>
+        </w:tc>
+      </w:tr>
+      <w:tr>
+        <w:tc>
+          <w:tcPr>
+            <w:tcBorders>
+              <w:top w:val="single" w:color="000000" w:sz="1"/>
+              <w:left w:val="single" w:color="000000" w:sz="1"/>
+              <w:bottom w:val="single" w:color="000000" w:sz="1"/>
+              <w:right w:val="single" w:color="000000" w:sz="1"/>
+            </w:tcBorders>
+            <w:tcMar>
+              <w:top w:type="dxa" w:w="60"/>
+              <w:left w:type="dxa" w:w="80"/>
+              <w:bottom w:type="dxa" w:w="60"/>
+              <w:right w:type="dxa" w:w="80"/>
+            </w:tcMar>
+            <w:vAlign w:val="center"/>
+          </w:tcPr>
+          <w:p>
+            <w:pPr>
+              <w:spacing w:after="0" w:before="0" w:line="360"/>
+              <w:jc w:val="left"/>
+            </w:pPr>
+            <w:r>
+              <w:rPr>
+                <w:rFonts w:ascii="宋体" w:cs="宋体" w:eastAsia="宋体" w:hAnsi="宋体"/>
+                <w:sz w:val="21"/>
+                <w:szCs w:val="21"/>
+              </w:rPr>
+              <w:t xml:space="preserve">考评组签名：	年    月    日</w:t>
+            </w:r>
+          </w:p>
+        </w:tc>
+      </w:tr>
+      <w:tr>
+        <w:tc>
+          <w:tcPr>
+            <w:tcBorders>
+              <w:top w:val="single" w:color="000000" w:sz="1"/>
+              <w:left w:val="single" w:color="000000" w:sz="1"/>
+              <w:bottom w:val="single" w:color="000000" w:sz="1"/>
+              <w:right w:val="single" w:color="000000" w:sz="1"/>
+            </w:tcBorders>
+            <w:tcMar>
+              <w:top w:type="dxa" w:w="60"/>
+              <w:left w:type="dxa" w:w="80"/>
+              <w:bottom w:type="dxa" w:w="60"/>
+              <w:right w:type="dxa" w:w="80"/>
+            </w:tcMar>
+            <w:vAlign w:val="center"/>
+          </w:tcPr>
+          <w:p>
+            <w:pPr>
+              <w:spacing w:after="0" w:before="0" w:line="360"/>
+              <w:jc w:val="left"/>
+            </w:pPr>
+            <w:r>
+              <w:rPr>
+                <w:rFonts w:ascii="宋体" w:cs="宋体" w:eastAsia="宋体" w:hAnsi="宋体"/>
+                <w:b/>
+                <w:bCs/>
+                <w:sz w:val="21"/>
+                <w:szCs w:val="21"/>
+              </w:rPr>
+              <w:t xml:space="preserve">3.学院意见：</w:t>
+            </w:r>
+          </w:p>
+        </w:tc>
+      </w:tr>
+      <w:tr>
+        <w:tc>
+          <w:tcPr>
+            <w:tcBorders>
+              <w:top w:val="single" w:color="000000" w:sz="1"/>
+              <w:left w:val="single" w:color="000000" w:sz="1"/>
+              <w:bottom w:val="single" w:color="000000" w:sz="1"/>
+              <w:right w:val="single" w:color="000000" w:sz="1"/>
+            </w:tcBorders>
+            <w:tcMar>
+              <w:top w:type="dxa" w:w="60"/>
+              <w:left w:type="dxa" w:w="80"/>
+              <w:bottom w:type="dxa" w:w="60"/>
+              <w:right w:type="dxa" w:w="80"/>
+            </w:tcMar>
+            <w:vAlign w:val="center"/>
+          </w:tcPr>
+          <w:p>
+            <w:pPr>
+              <w:spacing w:after="0" w:before="0" w:line="360"/>
+              <w:jc w:val="left"/>
+            </w:pPr>
+            <w:r>
+              <w:rPr>
+                <w:rFonts w:ascii="宋体" w:cs="宋体" w:eastAsia="宋体" w:hAnsi="宋体"/>
+                <w:sz w:val="21"/>
+                <w:szCs w:val="21"/>
+              </w:rPr>
+              <w:t xml:space="preserve">负责人签名：                         年    月    日</w:t>
+            </w:r>
+          </w:p>
+        </w:tc>
+      </w:tr>
+    </w:tbl>
+    <w:p>
+      <w:r>
+        <w:br w:type="page"/>
+      </w:r>
+    </w:p>
+    <w:p>
+      <w:pPr>
+        <w:spacing w:after="120" w:before="120" w:line="360"/>
+        <w:jc w:val="center"/>
+      </w:pPr>
+      <w:r>
+        <w:rPr>
+          <w:rFonts w:ascii="宋体" w:cs="宋体" w:eastAsia="宋体" w:hAnsi="宋体"/>
+          <w:b/>
+          <w:bCs/>
+          <w:sz w:val="24"/>
+          <w:szCs w:val="24"/>
+        </w:rPr>
+        <w:t xml:space="preserve">研究计划及完成情况</w:t>
+      </w:r>
+    </w:p>
+    <w:tbl>
+      <w:tblPr>
+        <w:tblW w:type="dxa" w:w="9000"/>
+        <w:tblBorders>
+          <w:top w:val="single" w:color="auto" w:sz="4"/>
+          <w:left w:val="single" w:color="auto" w:sz="4"/>
+          <w:bottom w:val="single" w:color="auto" w:sz="4"/>
+          <w:right w:val="single" w:color="auto" w:sz="4"/>
+          <w:insideH w:val="single" w:color="auto" w:sz="4"/>
+          <w:insideV w:val="single" w:color="auto" w:sz="4"/>
+        </w:tblBorders>
+      </w:tblPr>
+      <w:tblGrid>
+        <w:gridCol w:w="2000"/>
+        <w:gridCol w:w="5500"/>
+        <w:gridCol w:w="1500"/>
+      </w:tblGrid>
+      <w:tr>
+        <w:tc>
+          <w:tcPr>
+            <w:tcBorders>
+              <w:top w:val="single" w:color="000000" w:sz="1"/>
+              <w:left w:val="single" w:color="000000" w:sz="1"/>
+              <w:bottom w:val="single" w:color="000000" w:sz="1"/>
+              <w:right w:val="single" w:color="000000" w:sz="1"/>
+            </w:tcBorders>
+            <w:shd w:fill="D9E2F3" w:val="clear"/>
+            <w:tcMar>
+              <w:top w:type="dxa" w:w="60"/>
+              <w:left w:type="dxa" w:w="80"/>
+              <w:bottom w:type="dxa" w:w="60"/>
+              <w:right w:type="dxa" w:w="80"/>
+            </w:tcMar>
+            <w:vAlign w:val="center"/>
+          </w:tcPr>
+          <w:p>
+            <w:pPr>
+              <w:spacing w:after="0" w:before="0" w:line="360"/>
+              <w:jc w:val="center"/>
+            </w:pPr>
+            <w:r>
+              <w:rPr>
+                <w:rFonts w:ascii="宋体" w:cs="宋体" w:eastAsia="宋体" w:hAnsi="宋体"/>
+                <w:b/>
+                <w:bCs/>
+                <w:sz w:val="21"/>
+                <w:szCs w:val="21"/>
+              </w:rPr>
+              <w:t xml:space="preserve">起止年月</w:t>
+            </w:r>
+          </w:p>
+        </w:tc>
+        <w:tc>
+          <w:tcPr>
+            <w:tcBorders>
+              <w:top w:val="single" w:color="000000" w:sz="1"/>
+              <w:left w:val="single" w:color="000000" w:sz="1"/>
+              <w:bottom w:val="single" w:color="000000" w:sz="1"/>
+              <w:right w:val="single" w:color="000000" w:sz="1"/>
+            </w:tcBorders>
+            <w:shd w:fill="D9E2F3" w:val="clear"/>
+            <w:tcMar>
+              <w:top w:type="dxa" w:w="60"/>
+              <w:left w:type="dxa" w:w="80"/>
+              <w:bottom w:type="dxa" w:w="60"/>
+              <w:right w:type="dxa" w:w="80"/>
+            </w:tcMar>
+            <w:vAlign w:val="center"/>
+          </w:tcPr>
+          <w:p>
+            <w:pPr>
+              <w:spacing w:after="0" w:before="0" w:line="360"/>
+              <w:jc w:val="center"/>
+            </w:pPr>
+            <w:r>
+              <w:rPr>
+                <w:rFonts w:ascii="宋体" w:cs="宋体" w:eastAsia="宋体" w:hAnsi="宋体"/>
+                <w:b/>
+                <w:bCs/>
+                <w:sz w:val="21"/>
+                <w:szCs w:val="21"/>
+              </w:rPr>
+              <w:t xml:space="preserve">完成内容</w:t>
+            </w:r>
+          </w:p>
+        </w:tc>
+        <w:tc>
+          <w:tcPr>
+            <w:tcBorders>
+              <w:top w:val="single" w:color="000000" w:sz="1"/>
+              <w:left w:val="single" w:color="000000" w:sz="1"/>
+              <w:bottom w:val="single" w:color="000000" w:sz="1"/>
+              <w:right w:val="single" w:color="000000" w:sz="1"/>
+            </w:tcBorders>
+            <w:shd w:fill="D9E2F3" w:val="clear"/>
+            <w:tcMar>
+              <w:top w:type="dxa" w:w="60"/>
+              <w:left w:type="dxa" w:w="80"/>
+              <w:bottom w:type="dxa" w:w="60"/>
+              <w:right w:type="dxa" w:w="80"/>
+            </w:tcMar>
+            <w:vAlign w:val="center"/>
+          </w:tcPr>
+          <w:p>
+            <w:pPr>
+              <w:spacing w:after="0" w:before="0" w:line="360"/>
+              <w:jc w:val="center"/>
+            </w:pPr>
+            <w:r>
+              <w:rPr>
+                <w:rFonts w:ascii="宋体" w:cs="宋体" w:eastAsia="宋体" w:hAnsi="宋体"/>
+                <w:b/>
+                <w:bCs/>
+                <w:sz w:val="21"/>
+                <w:szCs w:val="21"/>
+              </w:rPr>
+              <w:t xml:space="preserve">完成情况</w:t>
+            </w:r>
+          </w:p>
+        </w:tc>
+      </w:tr>
+      <w:tr>
+        <w:tc>
+          <w:tcPr>
+            <w:tcW w:type="dxa" w:w="2000"/>
+            <w:tcBorders>
+              <w:top w:val="single" w:color="000000" w:sz="1"/>
+              <w:left w:val="single" w:color="000000" w:sz="1"/>
+              <w:bottom w:val="single" w:color="000000" w:sz="1"/>
+              <w:right w:val="single" w:color="000000" w:sz="1"/>
+            </w:tcBorders>
+            <w:tcMar>
+              <w:top w:type="dxa" w:w="60"/>
+              <w:left w:type="dxa" w:w="80"/>
+              <w:bottom w:type="dxa" w:w="60"/>
+              <w:right w:type="dxa" w:w="80"/>
+            </w:tcMar>
+            <w:vAlign w:val="center"/>
+          </w:tcPr>
+          <w:p>
+            <w:pPr>
+              <w:spacing w:after="0" w:before="0" w:line="360"/>
+              <w:jc w:val="center"/>
+            </w:pPr>
+            <w:r>
+              <w:rPr>
+                <w:rFonts w:ascii="宋体" w:cs="宋体" w:eastAsia="宋体" w:hAnsi="宋体"/>
+                <w:sz w:val="21"/>
+                <w:szCs w:val="21"/>
+              </w:rPr>
+              <w:t xml:space="preserve">2025.07-2025.10</w:t>
+            </w:r>
+          </w:p>
+        </w:tc>
+        <w:tc>
+          <w:tcPr>
+            <w:tcW w:type="dxa" w:w="5500"/>
+            <w:tcBorders>
+              <w:top w:val="single" w:color="000000" w:sz="1"/>
+              <w:left w:val="single" w:color="000000" w:sz="1"/>
+              <w:bottom w:val="single" w:color="000000" w:sz="1"/>
+              <w:right w:val="single" w:color="000000" w:sz="1"/>
+            </w:tcBorders>
+            <w:tcMar>
+              <w:top w:type="dxa" w:w="60"/>
+              <w:left w:type="dxa" w:w="80"/>
+              <w:bottom w:type="dxa" w:w="60"/>
+              <w:right w:type="dxa" w:w="80"/>
+            </w:tcMar>
+            <w:vAlign w:val="center"/>
+          </w:tcPr>
+          <w:p>
+            <w:pPr>
+              <w:spacing w:after="0" w:before="0" w:line="360"/>
+              <w:jc w:val="left"/>
+            </w:pPr>
+            <w:r>
+              <w:rPr>
+                <w:rFonts w:ascii="宋体" w:cs="宋体" w:eastAsia="宋体" w:hAnsi="宋体"/>
+                <w:sz w:val="21"/>
+                <w:szCs w:val="21"/>
+              </w:rPr>
+              <w:t xml:space="preserve">阅读相关参考文献，调研国内外现状，完成论文的规划</w:t>
+            </w:r>
+          </w:p>
+        </w:tc>
+        <w:tc>
+          <w:tcPr>
+            <w:tcW w:type="dxa" w:w="1500"/>
+            <w:tcBorders>
+              <w:top w:val="single" w:color="000000" w:sz="1"/>
+              <w:left w:val="single" w:color="000000" w:sz="1"/>
+              <w:bottom w:val="single" w:color="000000" w:sz="1"/>
+              <w:right w:val="single" w:color="000000" w:sz="1"/>
+            </w:tcBorders>
+            <w:tcMar>
+              <w:top w:type="dxa" w:w="60"/>
+              <w:left w:type="dxa" w:w="80"/>
+              <w:bottom w:type="dxa" w:w="60"/>
+              <w:right w:type="dxa" w:w="80"/>
+            </w:tcMar>
+            <w:vAlign w:val="center"/>
+          </w:tcPr>
+          <w:p>
+            <w:pPr>
+              <w:spacing w:after="0" w:before="0" w:line="360"/>
+              <w:jc w:val="center"/>
+            </w:pPr>
+            <w:r>
+              <w:rPr>
+                <w:rFonts w:ascii="宋体" w:cs="宋体" w:eastAsia="宋体" w:hAnsi="宋体"/>
+                <w:sz w:val="21"/>
+                <w:szCs w:val="21"/>
+              </w:rPr>
+              <w:t xml:space="preserve">已完成</w:t>
+            </w:r>
+          </w:p>
+        </w:tc>
+      </w:tr>
+      <w:tr>
+        <w:tc>
+          <w:tcPr>
+            <w:tcW w:type="dxa" w:w="2000"/>
+            <w:tcBorders>
+              <w:top w:val="single" w:color="000000" w:sz="1"/>
+              <w:left w:val="single" w:color="000000" w:sz="1"/>
+              <w:bottom w:val="single" w:color="000000" w:sz="1"/>
+              <w:right w:val="single" w:color="000000" w:sz="1"/>
+            </w:tcBorders>
+            <w:tcMar>
+              <w:top w:type="dxa" w:w="60"/>
+              <w:left w:type="dxa" w:w="80"/>
+              <w:bottom w:type="dxa" w:w="60"/>
+              <w:right w:type="dxa" w:w="80"/>
+            </w:tcMar>
+            <w:vAlign w:val="center"/>
+          </w:tcPr>
+          <w:p>
+            <w:pPr>
+              <w:spacing w:after="0" w:before="0" w:line="360"/>
+              <w:jc w:val="center"/>
+            </w:pPr>
+            <w:r>
+              <w:rPr>
+                <w:rFonts w:ascii="宋体" w:cs="宋体" w:eastAsia="宋体" w:hAnsi="宋体"/>
+                <w:sz w:val="21"/>
+                <w:szCs w:val="21"/>
+              </w:rPr>
+              <w:t xml:space="preserve">2025.11-2026.01</w:t>
+            </w:r>
+          </w:p>
+        </w:tc>
+        <w:tc>
+          <w:tcPr>
+            <w:tcW w:type="dxa" w:w="5500"/>
+            <w:tcBorders>
+              <w:top w:val="single" w:color="000000" w:sz="1"/>
+              <w:left w:val="single" w:color="000000" w:sz="1"/>
+              <w:bottom w:val="single" w:color="000000" w:sz="1"/>
+              <w:right w:val="single" w:color="000000" w:sz="1"/>
+            </w:tcBorders>
+            <w:tcMar>
+              <w:top w:type="dxa" w:w="60"/>
+              <w:left w:type="dxa" w:w="80"/>
+              <w:bottom w:type="dxa" w:w="60"/>
+              <w:right w:type="dxa" w:w="80"/>
+            </w:tcMar>
+            <w:vAlign w:val="center"/>
+          </w:tcPr>
+          <w:p>
+            <w:pPr>
+              <w:spacing w:after="0" w:before="0" w:line="360"/>
+              <w:jc w:val="left"/>
+            </w:pPr>
+            <w:r>
+              <w:rPr>
+                <w:rFonts w:ascii="宋体" w:cs="宋体" w:eastAsia="宋体" w:hAnsi="宋体"/>
+                <w:sz w:val="21"/>
+                <w:szCs w:val="21"/>
+              </w:rPr>
+              <w:t xml:space="preserve">文献整理，验证常用电磁超声检测、多模态特征提取、Transformer架构</w:t>
+            </w:r>
+          </w:p>
+        </w:tc>
+        <w:tc>
+          <w:tcPr>
+            <w:tcW w:type="dxa" w:w="1500"/>
+            <w:tcBorders>
+              <w:top w:val="single" w:color="000000" w:sz="1"/>
+              <w:left w:val="single" w:color="000000" w:sz="1"/>
+              <w:bottom w:val="single" w:color="000000" w:sz="1"/>
+              <w:right w:val="single" w:color="000000" w:sz="1"/>
+            </w:tcBorders>
+            <w:tcMar>
+              <w:top w:type="dxa" w:w="60"/>
+              <w:left w:type="dxa" w:w="80"/>
+              <w:bottom w:type="dxa" w:w="60"/>
+              <w:right w:type="dxa" w:w="80"/>
+            </w:tcMar>
+            <w:vAlign w:val="center"/>
+          </w:tcPr>
+          <w:p>
+            <w:pPr>
+              <w:spacing w:after="0" w:before="0" w:line="360"/>
+              <w:jc w:val="center"/>
+            </w:pPr>
+            <w:r>
+              <w:rPr>
+                <w:rFonts w:ascii="宋体" w:cs="宋体" w:eastAsia="宋体" w:hAnsi="宋体"/>
+                <w:sz w:val="21"/>
+                <w:szCs w:val="21"/>
+              </w:rPr>
+              <w:t xml:space="preserve">已完成</w:t>
+            </w:r>
+          </w:p>
+        </w:tc>
+      </w:tr>
+      <w:tr>
+        <w:tc>
+          <w:tcPr>
+            <w:tcW w:type="dxa" w:w="2000"/>
+            <w:tcBorders>
+              <w:top w:val="single" w:color="000000" w:sz="1"/>
+              <w:left w:val="single" w:color="000000" w:sz="1"/>
+              <w:bottom w:val="single" w:color="000000" w:sz="1"/>
+              <w:right w:val="single" w:color="000000" w:sz="1"/>
+            </w:tcBorders>
+            <w:tcMar>
+              <w:top w:type="dxa" w:w="60"/>
+              <w:left w:type="dxa" w:w="80"/>
+              <w:bottom w:type="dxa" w:w="60"/>
+              <w:right w:type="dxa" w:w="80"/>
+            </w:tcMar>
+            <w:vAlign w:val="center"/>
+          </w:tcPr>
+          <w:p>
+            <w:pPr>
+              <w:spacing w:after="0" w:before="0" w:line="360"/>
+              <w:jc w:val="center"/>
+            </w:pPr>
+            <w:r>
+              <w:rPr>
+                <w:rFonts w:ascii="宋体" w:cs="宋体" w:eastAsia="宋体" w:hAnsi="宋体"/>
+                <w:sz w:val="21"/>
+                <w:szCs w:val="21"/>
+              </w:rPr>
+              <w:t xml:space="preserve">2026.02-2026.04</w:t>
+            </w:r>
+          </w:p>
+        </w:tc>
+        <w:tc>
+          <w:tcPr>
+            <w:tcW w:type="dxa" w:w="5500"/>
+            <w:tcBorders>
+              <w:top w:val="single" w:color="000000" w:sz="1"/>
+              <w:left w:val="single" w:color="000000" w:sz="1"/>
+              <w:bottom w:val="single" w:color="000000" w:sz="1"/>
+              <w:right w:val="single" w:color="000000" w:sz="1"/>
+            </w:tcBorders>
+            <w:tcMar>
+              <w:top w:type="dxa" w:w="60"/>
+              <w:left w:type="dxa" w:w="80"/>
+              <w:bottom w:type="dxa" w:w="60"/>
+              <w:right w:type="dxa" w:w="80"/>
+            </w:tcMar>
+            <w:vAlign w:val="center"/>
+          </w:tcPr>
+          <w:p>
+            <w:pPr>
+              <w:spacing w:after="0" w:before="0" w:line="360"/>
+              <w:jc w:val="left"/>
+            </w:pPr>
+            <w:r>
+              <w:rPr>
+                <w:rFonts w:ascii="宋体" w:cs="宋体" w:eastAsia="宋体" w:hAnsi="宋体"/>
+                <w:sz w:val="21"/>
+                <w:szCs w:val="21"/>
+              </w:rPr>
+              <w:t xml:space="preserve">开展无人机搭载电磁超声系统开发</w:t>
+            </w:r>
+          </w:p>
+        </w:tc>
+        <w:tc>
+          <w:tcPr>
+            <w:tcW w:type="dxa" w:w="1500"/>
+            <w:tcBorders>
+              <w:top w:val="single" w:color="000000" w:sz="1"/>
+              <w:left w:val="single" w:color="000000" w:sz="1"/>
+              <w:bottom w:val="single" w:color="000000" w:sz="1"/>
+              <w:right w:val="single" w:color="000000" w:sz="1"/>
+            </w:tcBorders>
+            <w:tcMar>
+              <w:top w:type="dxa" w:w="60"/>
+              <w:left w:type="dxa" w:w="80"/>
+              <w:bottom w:type="dxa" w:w="60"/>
+              <w:right w:type="dxa" w:w="80"/>
+            </w:tcMar>
+            <w:vAlign w:val="center"/>
+          </w:tcPr>
+          <w:p>
+            <w:pPr>
+              <w:spacing w:after="0" w:before="0" w:line="360"/>
+              <w:jc w:val="center"/>
+            </w:pPr>
+            <w:r>
+              <w:rPr>
+                <w:rFonts w:ascii="宋体" w:cs="宋体" w:eastAsia="宋体" w:hAnsi="宋体"/>
+                <w:sz w:val="21"/>
+                <w:szCs w:val="21"/>
+              </w:rPr>
+              <w:t xml:space="preserve">已完成</w:t>
+            </w:r>
+          </w:p>
+        </w:tc>
+      </w:tr>
+      <w:tr>
+        <w:tc>
+          <w:tcPr>
+            <w:tcW w:type="dxa" w:w="2000"/>
+            <w:tcBorders>
+              <w:top w:val="single" w:color="000000" w:sz="1"/>
+              <w:left w:val="single" w:color="000000" w:sz="1"/>
+              <w:bottom w:val="single" w:color="000000" w:sz="1"/>
+              <w:right w:val="single" w:color="000000" w:sz="1"/>
+            </w:tcBorders>
+            <w:tcMar>
+              <w:top w:type="dxa" w:w="60"/>
+              <w:left w:type="dxa" w:w="80"/>
+              <w:bottom w:type="dxa" w:w="60"/>
+              <w:right w:type="dxa" w:w="80"/>
+            </w:tcMar>
+            <w:vAlign w:val="center"/>
+          </w:tcPr>
+          <w:p>
+            <w:pPr>
+              <w:spacing w:after="0" w:before="0" w:line="360"/>
+              <w:jc w:val="center"/>
+            </w:pPr>
+            <w:r>
+              <w:rPr>
+                <w:rFonts w:ascii="宋体" w:cs="宋体" w:eastAsia="宋体" w:hAnsi="宋体"/>
+                <w:sz w:val="21"/>
+                <w:szCs w:val="21"/>
+              </w:rPr>
+              <w:t xml:space="preserve">2026.05-2026.11</w:t>
+            </w:r>
+          </w:p>
+        </w:tc>
+        <w:tc>
+          <w:tcPr>
+            <w:tcW w:type="dxa" w:w="5500"/>
+            <w:tcBorders>
+              <w:top w:val="single" w:color="000000" w:sz="1"/>
+              <w:left w:val="single" w:color="000000" w:sz="1"/>
+              <w:bottom w:val="single" w:color="000000" w:sz="1"/>
+              <w:right w:val="single" w:color="000000" w:sz="1"/>
+            </w:tcBorders>
+            <w:tcMar>
+              <w:top w:type="dxa" w:w="60"/>
+              <w:left w:type="dxa" w:w="80"/>
+              <w:bottom w:type="dxa" w:w="60"/>
+              <w:right w:type="dxa" w:w="80"/>
+            </w:tcMar>
+            <w:vAlign w:val="center"/>
+          </w:tcPr>
+          <w:p>
+            <w:pPr>
+              <w:spacing w:after="0" w:before="0" w:line="360"/>
+              <w:jc w:val="left"/>
+            </w:pPr>
+            <w:r>
+              <w:rPr>
+                <w:rFonts w:ascii="宋体" w:cs="宋体" w:eastAsia="宋体" w:hAnsi="宋体"/>
+                <w:sz w:val="21"/>
+                <w:szCs w:val="21"/>
+              </w:rPr>
+              <w:t xml:space="preserve">在硬件系统完成数据采集与方案验证</w:t>
+            </w:r>
+          </w:p>
+        </w:tc>
+        <w:tc>
+          <w:tcPr>
+            <w:tcW w:type="dxa" w:w="1500"/>
+            <w:tcBorders>
+              <w:top w:val="single" w:color="000000" w:sz="1"/>
+              <w:left w:val="single" w:color="000000" w:sz="1"/>
+              <w:bottom w:val="single" w:color="000000" w:sz="1"/>
+              <w:right w:val="single" w:color="000000" w:sz="1"/>
+            </w:tcBorders>
+            <w:tcMar>
+              <w:top w:type="dxa" w:w="60"/>
+              <w:left w:type="dxa" w:w="80"/>
+              <w:bottom w:type="dxa" w:w="60"/>
+              <w:right w:type="dxa" w:w="80"/>
+            </w:tcMar>
+            <w:vAlign w:val="center"/>
+          </w:tcPr>
+          <w:p>
+            <w:pPr>
+              <w:spacing w:after="0" w:before="0" w:line="360"/>
+              <w:jc w:val="center"/>
+            </w:pPr>
+            <w:r>
+              <w:rPr>
+                <w:rFonts w:ascii="宋体" w:cs="宋体" w:eastAsia="宋体" w:hAnsi="宋体"/>
+                <w:sz w:val="21"/>
+                <w:szCs w:val="21"/>
+              </w:rPr>
+              <w:t xml:space="preserve">进行中</w:t>
+            </w:r>
+          </w:p>
+        </w:tc>
+      </w:tr>
+      <w:tr>
+        <w:tc>
+          <w:tcPr>
+            <w:tcW w:type="dxa" w:w="2000"/>
+            <w:tcBorders>
+              <w:top w:val="single" w:color="000000" w:sz="1"/>
+              <w:left w:val="single" w:color="000000" w:sz="1"/>
+              <w:bottom w:val="single" w:color="000000" w:sz="1"/>
+              <w:right w:val="single" w:color="000000" w:sz="1"/>
+            </w:tcBorders>
+            <w:tcMar>
+              <w:top w:type="dxa" w:w="60"/>
+              <w:left w:type="dxa" w:w="80"/>
+              <w:bottom w:type="dxa" w:w="60"/>
+              <w:right w:type="dxa" w:w="80"/>
+            </w:tcMar>
+            <w:vAlign w:val="center"/>
+          </w:tcPr>
+          <w:p>
+            <w:pPr>
+              <w:spacing w:after="0" w:before="0" w:line="360"/>
+              <w:jc w:val="center"/>
+            </w:pPr>
+            <w:r>
+              <w:rPr>
+                <w:rFonts w:ascii="宋体" w:cs="宋体" w:eastAsia="宋体" w:hAnsi="宋体"/>
+                <w:sz w:val="21"/>
+                <w:szCs w:val="21"/>
+              </w:rPr>
+              <w:t xml:space="preserve">2026.12-2027.03</w:t>
+            </w:r>
+          </w:p>
+        </w:tc>
+        <w:tc>
+          <w:tcPr>
+            <w:tcW w:type="dxa" w:w="5500"/>
+            <w:tcBorders>
+              <w:top w:val="single" w:color="000000" w:sz="1"/>
+              <w:left w:val="single" w:color="000000" w:sz="1"/>
+              <w:bottom w:val="single" w:color="000000" w:sz="1"/>
+              <w:right w:val="single" w:color="000000" w:sz="1"/>
+            </w:tcBorders>
+            <w:tcMar>
+              <w:top w:type="dxa" w:w="60"/>
+              <w:left w:type="dxa" w:w="80"/>
+              <w:bottom w:type="dxa" w:w="60"/>
+              <w:right w:type="dxa" w:w="80"/>
+            </w:tcMar>
+            <w:vAlign w:val="center"/>
+          </w:tcPr>
+          <w:p>
+            <w:pPr>
+              <w:spacing w:after="0" w:before="0" w:line="360"/>
+              <w:jc w:val="left"/>
+            </w:pPr>
+            <w:r>
+              <w:rPr>
+                <w:rFonts w:ascii="宋体" w:cs="宋体" w:eastAsia="宋体" w:hAnsi="宋体"/>
+                <w:sz w:val="21"/>
+                <w:szCs w:val="21"/>
+              </w:rPr>
+              <w:t xml:space="preserve">学位论文的撰写和修改</w:t>
+            </w:r>
+          </w:p>
+        </w:tc>
+        <w:tc>
+          <w:tcPr>
+            <w:tcW w:type="dxa" w:w="1500"/>
+            <w:tcBorders>
+              <w:top w:val="single" w:color="000000" w:sz="1"/>
+              <w:left w:val="single" w:color="000000" w:sz="1"/>
+              <w:bottom w:val="single" w:color="000000" w:sz="1"/>
+              <w:right w:val="single" w:color="000000" w:sz="1"/>
+            </w:tcBorders>
+            <w:tcMar>
+              <w:top w:type="dxa" w:w="60"/>
+              <w:left w:type="dxa" w:w="80"/>
+              <w:bottom w:type="dxa" w:w="60"/>
+              <w:right w:type="dxa" w:w="80"/>
+            </w:tcMar>
+            <w:vAlign w:val="center"/>
+          </w:tcPr>
+          <w:p>
+            <w:pPr>
+              <w:spacing w:after="0" w:before="0" w:line="360"/>
+              <w:jc w:val="center"/>
+            </w:pPr>
+            <w:r>
+              <w:rPr>
+                <w:rFonts w:ascii="宋体" w:cs="宋体" w:eastAsia="宋体" w:hAnsi="宋体"/>
+                <w:sz w:val="21"/>
+                <w:szCs w:val="21"/>
+              </w:rPr>
+              <w:t xml:space="preserve">待开始</w:t>
+            </w:r>
+          </w:p>
+        </w:tc>
+      </w:tr>
+    </w:tbl>
+    <w:p>
+      <w:pPr>
+        <w:spacing w:after="0" w:before="240" w:line="360"/>
+        <w:jc w:val="left"/>
+      </w:pPr>
+      <w:r>
+        <w:rPr>
+          <w:rFonts w:ascii="宋体" w:cs="宋体" w:eastAsia="宋体" w:hAnsi="宋体"/>
+          <w:sz w:val="21"/>
+          <w:szCs w:val="21"/>
+        </w:rPr>
+        <w:t xml:space="preserve"/>
+      </w:r>
+    </w:p>
+    <w:p>
+      <w:pPr>
+        <w:spacing w:after="0" w:before="0" w:line="360"/>
+        <w:jc w:val="left"/>
+      </w:pPr>
+      <w:r>
+        <w:rPr>
+          <w:rFonts w:ascii="宋体" w:cs="宋体" w:eastAsia="宋体" w:hAnsi="宋体"/>
+          <w:sz w:val="18"/>
+          <w:szCs w:val="18"/>
+        </w:rPr>
+        <w:t xml:space="preserve">注：根据开题报告中的研究计划填写，已完成的阶段标注已完成，正在进行的标注进行中。</w:t>
+      </w:r>
+    </w:p>
+    <w:sectPr>
+      <w:pgSz w:w="11906" w:h="16838" w:orient="portrait"/>
+      <w:pgMar w:top="1440" w:right="1440" w:bottom="1440" w:left="1440" w:header="708" w:footer="708" w:gutter="0"/>
+      <w:pgNumType/>
+      <w:docGrid w:linePitch="360"/>
+    </w:sectPr>
+  </w:body>
+</w:document>
 </file>
 
 <file path=word/endnotes.xml><?xml version="1.0" encoding="utf-8"?>

</xml_diff>

<commit_message>
@ docs(thesis): add complete master thesis LaTeX source and Nature-style sections
- Add thesis chapters (7 chapters + appendices) with multi-file structure
- Expand 研究背景与意义 to ~1800 chars in Nature journal style
- Rewrite UAV NDT literature review as ~3100-char technology evolution
  narrative covering visual inspection → contact NDT → EMAT coupling
- Add EMAT electromagnetic-elastic coupling schematic figure (SVG/PDF/PNG)
- Update CLAUDE.md with thesis compilation instructions (XeLaTeX/MiKTeX)
- Add .gitignore for LaTeX build artifacts
@
</commit_message>
<xml_diff>
--- a/毕业设计/中期/华羽霄_中期报告表.docx
+++ b/毕业设计/中期/华羽霄_中期报告表.docx
@@ -1102,19 +1102,7 @@
                   <w:rPr>
                     <w:rFonts w:ascii="Cambria Math" w:hAnsi="Cambria Math"/>
                   </w:rPr>
-                  <m:t>J</m:t>
-                </m:r>
-                <m:r>
-                  <w:rPr>
-                    <w:rFonts w:ascii="Cambria Math" w:hAnsi="Cambria Math"/>
-                  </w:rPr>
-                  <m:t>×</m:t>
-                </m:r>
-                <m:r>
-                  <w:rPr>
-                    <w:rFonts w:ascii="Cambria Math" w:hAnsi="Cambria Math"/>
-                  </w:rPr>
-                  <m:t>B</m:t>
+                  <m:t>J×B</m:t>
                 </m:r>
               </m:oMath>
             </m:oMathPara>
@@ -1185,19 +1173,7 @@
                       <w:rPr>
                         <w:rFonts w:ascii="Cambria Math" w:hAnsi="Cambria Math"/>
                       </w:rPr>
-                      <m:t>v</m:t>
-                    </m:r>
-                    <m:r>
-                      <w:rPr>
-                        <w:rFonts w:ascii="Cambria Math" w:hAnsi="Cambria Math"/>
-                      </w:rPr>
-                      <m:t>×</m:t>
-                    </m:r>
-                    <m:r>
-                      <w:rPr>
-                        <w:rFonts w:ascii="Cambria Math" w:hAnsi="Cambria Math"/>
-                      </w:rPr>
-                      <m:t>B</m:t>
+                      <m:t>v×B</m:t>
                     </m:r>
                   </m:e>
                 </m:d>
@@ -1339,19 +1315,7 @@
                   <w:rPr>
                     <w:rFonts w:ascii="Cambria Math" w:hAnsi="Cambria Math"/>
                   </w:rPr>
-                  <m:t>∇</m:t>
-                </m:r>
-                <m:r>
-                  <w:rPr>
-                    <w:rFonts w:ascii="Cambria Math" w:hAnsi="Cambria Math"/>
-                  </w:rPr>
-                  <m:t>⋅</m:t>
-                </m:r>
-                <m:r>
-                  <w:rPr>
-                    <w:rFonts w:ascii="Cambria Math" w:hAnsi="Cambria Math"/>
-                  </w:rPr>
-                  <m:t>σ</m:t>
+                  <m:t>∇⋅σ</m:t>
                 </m:r>
                 <m:r>
                   <m:rPr>
@@ -1401,31 +1365,7 @@
                   <w:rPr>
                     <w:rFonts w:ascii="Cambria Math" w:hAnsi="Cambria Math"/>
                   </w:rPr>
-                  <m:t>C</m:t>
-                </m:r>
-                <m:r>
-                  <w:rPr>
-                    <w:rFonts w:ascii="Cambria Math" w:hAnsi="Cambria Math"/>
-                  </w:rPr>
-                  <m:t>:</m:t>
-                </m:r>
-                <m:r>
-                  <w:rPr>
-                    <w:rFonts w:ascii="Cambria Math" w:hAnsi="Cambria Math"/>
-                  </w:rPr>
-                  <m:t>ε</m:t>
-                </m:r>
-                <m:r>
-                  <w:rPr>
-                    <w:rFonts w:ascii="Cambria Math" w:hAnsi="Cambria Math"/>
-                  </w:rPr>
-                  <m:t>,</m:t>
-                </m:r>
-                <m:r>
-                  <w:rPr>
-                    <w:rFonts w:ascii="Cambria Math" w:hAnsi="Cambria Math"/>
-                  </w:rPr>
-                  <m:t>ε</m:t>
+                  <m:t>C:ε,ε</m:t>
                 </m:r>
                 <m:r>
                   <m:rPr>
@@ -1608,13 +1548,7 @@
                           <w:rPr>
                             <w:rFonts w:ascii="Cambria Math" w:hAnsi="Cambria Math"/>
                           </w:rPr>
-                          <m:t>2</m:t>
-                        </m:r>
-                        <m:r>
-                          <w:rPr>
-                            <w:rFonts w:ascii="Cambria Math" w:hAnsi="Cambria Math"/>
-                          </w:rPr>
-                          <m:t>μ</m:t>
+                          <m:t>2μ</m:t>
                         </m:r>
                       </m:num>
                       <m:den>
@@ -1726,15 +1660,6 @@
               <w:jc w:val="left"/>
             </w:pPr>
             <w:r>
-              <w:t>从</w:t>
-            </w:r>
-            <w:r>
-              <w:t>Nature</w:t>
-            </w:r>
-            <w:r>
-              <w:t>类论文常见的叙述方式看，理论模型应当把观测信号背后的机制链条写清楚，而不是把传感器输出视为黑箱特征。</w:t>
-            </w:r>
-            <w:r>
               <w:t>EMAT</w:t>
             </w:r>
             <w:r>
@@ -1919,13 +1844,7 @@
                       <w:rPr>
                         <w:rFonts w:ascii="Cambria Math" w:hAnsi="Cambria Math"/>
                       </w:rPr>
-                      <m:t>2</m:t>
-                    </m:r>
-                    <m:r>
-                      <w:rPr>
-                        <w:rFonts w:ascii="Cambria Math" w:hAnsi="Cambria Math"/>
-                      </w:rPr>
-                      <m:t>π</m:t>
+                      <m:t>2π</m:t>
                     </m:r>
                     <m:sSub>
                       <m:sSubPr>
@@ -2699,7 +2618,6 @@
               <w:jc w:val="left"/>
             </w:pPr>
             <w:r>
-              <w:lastRenderedPageBreak/>
               <w:t>对任一模态，本研究采用局部时间窗口内的加权插值完成对齐：</w:t>
             </w:r>
           </w:p>
@@ -2807,19 +2725,7 @@
                           <w:rPr>
                             <w:rFonts w:ascii="Cambria Math" w:hAnsi="Cambria Math"/>
                           </w:rPr>
-                          <m:t>t</m:t>
-                        </m:r>
-                        <m:r>
-                          <w:rPr>
-                            <w:rFonts w:ascii="Cambria Math" w:hAnsi="Cambria Math"/>
-                          </w:rPr>
-                          <m:t>,</m:t>
-                        </m:r>
-                        <m:r>
-                          <w:rPr>
-                            <w:rFonts w:ascii="Cambria Math" w:hAnsi="Cambria Math"/>
-                          </w:rPr>
-                          <m:t>k</m:t>
+                          <m:t>t,k</m:t>
                         </m:r>
                       </m:sub>
                       <m:sup>
@@ -2932,19 +2838,7 @@
                           <w:rPr>
                             <w:rFonts w:ascii="Cambria Math" w:hAnsi="Cambria Math"/>
                           </w:rPr>
-                          <m:t>t</m:t>
-                        </m:r>
-                        <m:r>
-                          <w:rPr>
-                            <w:rFonts w:ascii="Cambria Math" w:hAnsi="Cambria Math"/>
-                          </w:rPr>
-                          <m:t>,</m:t>
-                        </m:r>
-                        <m:r>
-                          <w:rPr>
-                            <w:rFonts w:ascii="Cambria Math" w:hAnsi="Cambria Math"/>
-                          </w:rPr>
-                          <m:t>k</m:t>
+                          <m:t>t,k</m:t>
                         </m:r>
                       </m:sub>
                       <m:sup>
@@ -3113,19 +3007,7 @@
                               <w:rPr>
                                 <w:rFonts w:ascii="Cambria Math" w:hAnsi="Cambria Math"/>
                               </w:rPr>
-                              <m:t>L</m:t>
-                            </m:r>
-                            <m:r>
-                              <w:rPr>
-                                <w:rFonts w:ascii="Cambria Math" w:hAnsi="Cambria Math"/>
-                              </w:rPr>
-                              <m:t>:</m:t>
-                            </m:r>
-                            <m:r>
-                              <w:rPr>
-                                <w:rFonts w:ascii="Cambria Math" w:hAnsi="Cambria Math"/>
-                              </w:rPr>
-                              <m:t>t</m:t>
+                              <m:t>L:t</m:t>
                             </m:r>
                           </m:sub>
                           <m:sup>
@@ -3145,19 +3027,7 @@
                   <w:rPr>
                     <w:rFonts w:ascii="Cambria Math" w:hAnsi="Cambria Math"/>
                   </w:rPr>
-                  <m:t>,</m:t>
-                </m:r>
-                <m:r>
-                  <w:rPr>
-                    <w:rFonts w:ascii="Cambria Math" w:hAnsi="Cambria Math"/>
-                  </w:rPr>
-                  <m:t>m</m:t>
-                </m:r>
-                <m:r>
-                  <w:rPr>
-                    <w:rFonts w:ascii="Cambria Math" w:hAnsi="Cambria Math"/>
-                  </w:rPr>
-                  <m:t>∈</m:t>
+                  <m:t>,m∈</m:t>
                 </m:r>
                 <m:r>
                   <m:rPr>
@@ -3170,31 +3040,7 @@
                   <w:rPr>
                     <w:rFonts w:ascii="Cambria Math" w:hAnsi="Cambria Math"/>
                   </w:rPr>
-                  <m:t>u</m:t>
-                </m:r>
-                <m:r>
-                  <w:rPr>
-                    <w:rFonts w:ascii="Cambria Math" w:hAnsi="Cambria Math"/>
-                  </w:rPr>
-                  <m:t>,</m:t>
-                </m:r>
-                <m:r>
-                  <w:rPr>
-                    <w:rFonts w:ascii="Cambria Math" w:hAnsi="Cambria Math"/>
-                  </w:rPr>
-                  <m:t>p</m:t>
-                </m:r>
-                <m:r>
-                  <w:rPr>
-                    <w:rFonts w:ascii="Cambria Math" w:hAnsi="Cambria Math"/>
-                  </w:rPr>
-                  <m:t>,</m:t>
-                </m:r>
-                <m:r>
-                  <w:rPr>
-                    <w:rFonts w:ascii="Cambria Math" w:hAnsi="Cambria Math"/>
-                  </w:rPr>
-                  <m:t>v</m:t>
+                  <m:t>u,p,v</m:t>
                 </m:r>
                 <m:r>
                   <m:rPr>
@@ -3252,19 +3098,7 @@
                       <w:rPr>
                         <w:rFonts w:ascii="Cambria Math" w:hAnsi="Cambria Math"/>
                       </w:rPr>
-                      <m:t>pos</m:t>
-                    </m:r>
-                    <m:r>
-                      <w:rPr>
-                        <w:rFonts w:ascii="Cambria Math" w:hAnsi="Cambria Math"/>
-                      </w:rPr>
-                      <m:t>,2</m:t>
-                    </m:r>
-                    <m:r>
-                      <w:rPr>
-                        <w:rFonts w:ascii="Cambria Math" w:hAnsi="Cambria Math"/>
-                      </w:rPr>
-                      <m:t>i</m:t>
+                      <m:t>pos,2i</m:t>
                     </m:r>
                   </m:e>
                 </m:d>
@@ -3328,13 +3162,7 @@
                               <w:rPr>
                                 <w:rFonts w:ascii="Cambria Math" w:hAnsi="Cambria Math"/>
                               </w:rPr>
-                              <m:t>2</m:t>
-                            </m:r>
-                            <m:r>
-                              <w:rPr>
-                                <w:rFonts w:ascii="Cambria Math" w:hAnsi="Cambria Math"/>
-                              </w:rPr>
-                              <m:t>i</m:t>
+                              <m:t>2i</m:t>
                             </m:r>
                             <m:r>
                               <m:rPr>
@@ -3408,19 +3236,7 @@
                       <w:rPr>
                         <w:rFonts w:ascii="Cambria Math" w:hAnsi="Cambria Math"/>
                       </w:rPr>
-                      <m:t>pos</m:t>
-                    </m:r>
-                    <m:r>
-                      <w:rPr>
-                        <w:rFonts w:ascii="Cambria Math" w:hAnsi="Cambria Math"/>
-                      </w:rPr>
-                      <m:t>,2</m:t>
-                    </m:r>
-                    <m:r>
-                      <w:rPr>
-                        <w:rFonts w:ascii="Cambria Math" w:hAnsi="Cambria Math"/>
-                      </w:rPr>
-                      <m:t>i</m:t>
+                      <m:t>pos,2i</m:t>
                     </m:r>
                     <m:r>
                       <m:rPr>
@@ -3497,13 +3313,7 @@
                               <w:rPr>
                                 <w:rFonts w:ascii="Cambria Math" w:hAnsi="Cambria Math"/>
                               </w:rPr>
-                              <m:t>2</m:t>
-                            </m:r>
-                            <m:r>
-                              <w:rPr>
-                                <w:rFonts w:ascii="Cambria Math" w:hAnsi="Cambria Math"/>
-                              </w:rPr>
-                              <m:t>i</m:t>
+                              <m:t>2i</m:t>
                             </m:r>
                             <m:r>
                               <m:rPr>
@@ -3668,9 +3478,6 @@
               <w:spacing w:before="60" w:after="60" w:line="300" w:lineRule="auto"/>
               <w:ind w:firstLine="420"/>
               <w:jc w:val="center"/>
-              <w:rPr>
-                <w:rFonts w:hint="eastAsia"/>
-              </w:rPr>
             </w:pPr>
             <m:oMathPara>
               <m:oMath>
@@ -4136,13 +3943,7 @@
                   <w:rPr>
                     <w:rFonts w:ascii="Cambria Math" w:hAnsi="Cambria Math"/>
                   </w:rPr>
-                  <m:t>L</m:t>
-                </m:r>
-                <m:r>
-                  <w:rPr>
-                    <w:rFonts w:ascii="Cambria Math" w:hAnsi="Cambria Math"/>
-                  </w:rPr>
-                  <m:t>=</m:t>
+                  <m:t>L=</m:t>
                 </m:r>
                 <m:sSub>
                   <m:sSubPr>
@@ -4660,13 +4461,7 @@
                       <w:rPr>
                         <w:rFonts w:ascii="Cambria Math" w:hAnsi="Cambria Math"/>
                       </w:rPr>
-                      <m:t>m</m:t>
-                    </m:r>
-                    <m:r>
-                      <w:rPr>
-                        <w:rFonts w:ascii="Cambria Math" w:hAnsi="Cambria Math"/>
-                      </w:rPr>
-                      <m:t>∈</m:t>
+                      <m:t>m∈</m:t>
                     </m:r>
                     <m:r>
                       <m:rPr>
@@ -4679,31 +4474,7 @@
                       <w:rPr>
                         <w:rFonts w:ascii="Cambria Math" w:hAnsi="Cambria Math"/>
                       </w:rPr>
-                      <m:t>u</m:t>
-                    </m:r>
-                    <m:r>
-                      <w:rPr>
-                        <w:rFonts w:ascii="Cambria Math" w:hAnsi="Cambria Math"/>
-                      </w:rPr>
-                      <m:t>,</m:t>
-                    </m:r>
-                    <m:r>
-                      <w:rPr>
-                        <w:rFonts w:ascii="Cambria Math" w:hAnsi="Cambria Math"/>
-                      </w:rPr>
-                      <m:t>p</m:t>
-                    </m:r>
-                    <m:r>
-                      <w:rPr>
-                        <w:rFonts w:ascii="Cambria Math" w:hAnsi="Cambria Math"/>
-                      </w:rPr>
-                      <m:t>,</m:t>
-                    </m:r>
-                    <m:r>
-                      <w:rPr>
-                        <w:rFonts w:ascii="Cambria Math" w:hAnsi="Cambria Math"/>
-                      </w:rPr>
-                      <m:t>v</m:t>
+                      <m:t>u,p,v</m:t>
                     </m:r>
                     <m:r>
                       <m:rPr>
@@ -4845,10 +4616,7 @@
               <w:jc w:val="left"/>
             </w:pPr>
             <w:r>
-              <w:t>该权重具有清晰</w:t>
-            </w:r>
-            <w:r>
-              <w:t>的工程含义：它不是任意注意力热图，而是对</w:t>
+              <w:t>该权重具有清晰的工程含义：它不是任意注意力热图，而是对</w:t>
             </w:r>
             <w:r>
               <w:t>“</w:t>
@@ -6164,9 +5932,6 @@
               <w:spacing w:line="300" w:lineRule="auto"/>
               <w:ind w:firstLine="420"/>
               <w:jc w:val="left"/>
-              <w:rPr>
-                <w:rFonts w:hint="eastAsia"/>
-              </w:rPr>
             </w:pPr>
             <w:r>
               <w:t>下一阶段将基于已采集数据完成特征标注、模型训练与消融实验，重点验证物理约束注意力相对于单模态阈值、普通</w:t>
@@ -7664,6 +7429,9 @@
               <w:spacing w:line="276" w:lineRule="auto"/>
               <w:ind w:firstLine="422"/>
               <w:jc w:val="center"/>
+              <w:rPr>
+                <w:rFonts w:hint="eastAsia"/>
+              </w:rPr>
             </w:pPr>
             <w:r>
               <w:rPr>
@@ -7683,6 +7451,9 @@
               <w:spacing w:line="276" w:lineRule="auto"/>
               <w:ind w:firstLine="422"/>
               <w:jc w:val="center"/>
+              <w:rPr>
+                <w:rFonts w:hint="eastAsia"/>
+              </w:rPr>
             </w:pPr>
             <w:r>
               <w:rPr>
@@ -7702,6 +7473,9 @@
               <w:spacing w:line="276" w:lineRule="auto"/>
               <w:ind w:firstLine="422"/>
               <w:jc w:val="center"/>
+              <w:rPr>
+                <w:rFonts w:hint="eastAsia"/>
+              </w:rPr>
             </w:pPr>
             <w:r>
               <w:rPr>
@@ -7726,6 +7500,9 @@
               <w:spacing w:line="276" w:lineRule="auto"/>
               <w:ind w:firstLine="420"/>
               <w:jc w:val="center"/>
+              <w:rPr>
+                <w:rFonts w:hint="eastAsia"/>
+              </w:rPr>
             </w:pPr>
             <w:r>
               <w:t>2025.07-2025.10</w:t>
@@ -7742,6 +7519,9 @@
               <w:spacing w:line="276" w:lineRule="auto"/>
               <w:ind w:firstLine="420"/>
               <w:jc w:val="left"/>
+              <w:rPr>
+                <w:rFonts w:hint="eastAsia"/>
+              </w:rPr>
             </w:pPr>
             <w:r>
               <w:t>阅读相关参考文献，调研国内外现状，完成论文的规划</w:t>
@@ -7758,6 +7538,9 @@
               <w:spacing w:line="276" w:lineRule="auto"/>
               <w:ind w:firstLine="420"/>
               <w:jc w:val="center"/>
+              <w:rPr>
+                <w:rFonts w:hint="eastAsia"/>
+              </w:rPr>
             </w:pPr>
             <w:r>
               <w:t>已完成</w:t>
@@ -7779,6 +7562,9 @@
               <w:spacing w:line="276" w:lineRule="auto"/>
               <w:ind w:firstLine="420"/>
               <w:jc w:val="center"/>
+              <w:rPr>
+                <w:rFonts w:hint="eastAsia"/>
+              </w:rPr>
             </w:pPr>
             <w:r>
               <w:t>2025.11-2026.01</w:t>
@@ -7795,6 +7581,9 @@
               <w:spacing w:line="276" w:lineRule="auto"/>
               <w:ind w:firstLine="420"/>
               <w:jc w:val="left"/>
+              <w:rPr>
+                <w:rFonts w:hint="eastAsia"/>
+              </w:rPr>
             </w:pPr>
             <w:r>
               <w:t>文献整理，验证常用电磁超声检测、多模态特征提取、</w:t>
@@ -7817,6 +7606,9 @@
               <w:spacing w:line="276" w:lineRule="auto"/>
               <w:ind w:firstLine="420"/>
               <w:jc w:val="center"/>
+              <w:rPr>
+                <w:rFonts w:hint="eastAsia"/>
+              </w:rPr>
             </w:pPr>
             <w:r>
               <w:t>已完成</w:t>
@@ -7838,6 +7630,9 @@
               <w:spacing w:line="276" w:lineRule="auto"/>
               <w:ind w:firstLine="420"/>
               <w:jc w:val="center"/>
+              <w:rPr>
+                <w:rFonts w:hint="eastAsia"/>
+              </w:rPr>
             </w:pPr>
             <w:r>
               <w:t>2026.02-2026.04</w:t>
@@ -7854,6 +7649,9 @@
               <w:spacing w:line="276" w:lineRule="auto"/>
               <w:ind w:firstLine="420"/>
               <w:jc w:val="left"/>
+              <w:rPr>
+                <w:rFonts w:hint="eastAsia"/>
+              </w:rPr>
             </w:pPr>
             <w:r>
               <w:t>开展无人机搭载电磁超声系统开发</w:t>
@@ -7870,6 +7668,9 @@
               <w:spacing w:line="276" w:lineRule="auto"/>
               <w:ind w:firstLine="420"/>
               <w:jc w:val="center"/>
+              <w:rPr>
+                <w:rFonts w:hint="eastAsia"/>
+              </w:rPr>
             </w:pPr>
             <w:r>
               <w:t>已完成</w:t>
@@ -7891,6 +7692,9 @@
               <w:spacing w:line="276" w:lineRule="auto"/>
               <w:ind w:firstLine="420"/>
               <w:jc w:val="center"/>
+              <w:rPr>
+                <w:rFonts w:hint="eastAsia"/>
+              </w:rPr>
             </w:pPr>
             <w:r>
               <w:t>2026.05-2026.11</w:t>
@@ -7907,6 +7711,9 @@
               <w:spacing w:line="276" w:lineRule="auto"/>
               <w:ind w:firstLine="420"/>
               <w:jc w:val="left"/>
+              <w:rPr>
+                <w:rFonts w:hint="eastAsia"/>
+              </w:rPr>
             </w:pPr>
             <w:r>
               <w:t>在硬件系统完成数据采集与方案验证</w:t>
@@ -7923,6 +7730,9 @@
               <w:spacing w:line="276" w:lineRule="auto"/>
               <w:ind w:firstLine="420"/>
               <w:jc w:val="center"/>
+              <w:rPr>
+                <w:rFonts w:hint="eastAsia"/>
+              </w:rPr>
             </w:pPr>
             <w:r>
               <w:t>进行中</w:t>
@@ -7944,6 +7754,9 @@
               <w:spacing w:line="276" w:lineRule="auto"/>
               <w:ind w:firstLine="420"/>
               <w:jc w:val="center"/>
+              <w:rPr>
+                <w:rFonts w:hint="eastAsia"/>
+              </w:rPr>
             </w:pPr>
             <w:r>
               <w:t>2026.12-2027.03</w:t>
@@ -7960,6 +7773,9 @@
               <w:spacing w:line="276" w:lineRule="auto"/>
               <w:ind w:firstLine="420"/>
               <w:jc w:val="left"/>
+              <w:rPr>
+                <w:rFonts w:hint="eastAsia"/>
+              </w:rPr>
             </w:pPr>
             <w:r>
               <w:t>学位论文的撰写和修改</w:t>
@@ -7976,6 +7792,9 @@
               <w:spacing w:line="276" w:lineRule="auto"/>
               <w:ind w:firstLine="420"/>
               <w:jc w:val="center"/>
+              <w:rPr>
+                <w:rFonts w:hint="eastAsia"/>
+              </w:rPr>
             </w:pPr>
             <w:r>
               <w:t>待开始</w:t>
@@ -8837,6 +8656,7 @@
   <w:style w:type="character" w:default="1" w:styleId="a0">
     <w:name w:val="Default Paragraph Font"/>
     <w:uiPriority w:val="1"/>
+    <w:semiHidden/>
     <w:unhideWhenUsed/>
   </w:style>
   <w:style w:type="table" w:default="1" w:styleId="a1">

</xml_diff>